<commit_message>
Docs: cap nhat huong dan cai dat (ban 31-2, menu 15, Grafana link + bo cuc moi, them muc Zabbix); sinh lai .docx
</commit_message>
<xml_diff>
--- a/docs/Huong-Dan-Cai-Dat-ESXi-Exporter.docx
+++ b/docs/Huong-Dan-Cai-Dat-ESXi-Exporter.docx
@@ -59,7 +59,7 @@
           <w:sz w:val="22"/>
           <w:szCs w:val="22"/>
         </w:rPr>
-        <w:t xml:space="preserve">Phiên bản 2026.10.28  ·  Cài tự động và thủ công</w:t>
+        <w:t xml:space="preserve">Phiên bản 2026.10.31  ·  Cài tự động và thủ công</w:t>
       </w:r>
     </w:p>
     <w:p>
@@ -502,7 +502,7 @@
           </w:pPr>
           <w:hyperlink w:history="1" w:anchor="_Toc19">
             <w:r>
-              <w:t xml:space="preserve">7. Vận hành &amp; cập nhật</w:t>
+              <w:t xml:space="preserve">7. Zabbix (tùy chọn — thay / cùng Prometheus)</w:t>
             </w:r>
             <w:r>
               <w:tab/>
@@ -524,7 +524,7 @@
           </w:pPr>
           <w:hyperlink w:history="1" w:anchor="_Toc20">
             <w:r>
-              <w:t xml:space="preserve">8. Xử lý sự cố</w:t>
+              <w:t xml:space="preserve">8. Vận hành &amp; cập nhật</w:t>
             </w:r>
             <w:r>
               <w:tab/>
@@ -546,7 +546,7 @@
           </w:pPr>
           <w:hyperlink w:history="1" w:anchor="_Toc21">
             <w:r>
-              <w:t xml:space="preserve">9. Bảo mật</w:t>
+              <w:t xml:space="preserve">9. Xử lý sự cố</w:t>
             </w:r>
             <w:r>
               <w:tab/>
@@ -554,6 +554,28 @@
             <w:r>
               <w:fldChar w:fldCharType="begin" w:dirty="true"/>
               <w:instrText xml:space="preserve">PAGEREF _Toc21 \h</w:instrText>
+              <w:fldChar w:fldCharType="separate"/>
+              <w:fldChar w:fldCharType="end"/>
+            </w:r>
+          </w:hyperlink>
+        </w:p>
+        <w:p>
+          <w:pPr>
+            <w:pStyle w:val="TOC1"/>
+            <w:tabs>
+              <w:tab w:val="right" w:pos="9706" w:leader="dot"/>
+            </w:tabs>
+          </w:pPr>
+          <w:hyperlink w:history="1" w:anchor="_Toc22">
+            <w:r>
+              <w:t xml:space="preserve">10. Bảo mật</w:t>
+            </w:r>
+            <w:r>
+              <w:tab/>
+            </w:r>
+            <w:r>
+              <w:fldChar w:fldCharType="begin" w:dirty="true"/>
+              <w:instrText xml:space="preserve">PAGEREF _Toc22 \h</w:instrText>
               <w:fldChar w:fldCharType="separate"/>
               <w:fldChar w:fldCharType="end"/>
             </w:r>
@@ -2238,6 +2260,48 @@
           </w:p>
         </w:tc>
       </w:tr>
+      <w:tr>
+        <w:tc>
+          <w:tcPr>
+            <w:tcW w:type="dxa" w:w="900"/>
+            <w:tcMar>
+              <w:top w:type="dxa" w:w="40"/>
+              <w:left w:type="dxa" w:w="80"/>
+              <w:bottom w:type="dxa" w:w="40"/>
+              <w:right w:type="dxa" w:w="80"/>
+            </w:tcMar>
+          </w:tcPr>
+          <w:p>
+            <w:r>
+              <w:rPr>
+                <w:sz w:val="20"/>
+                <w:szCs w:val="20"/>
+              </w:rPr>
+              <w:t xml:space="preserve">15</w:t>
+            </w:r>
+          </w:p>
+        </w:tc>
+        <w:tc>
+          <w:tcPr>
+            <w:tcW w:type="dxa" w:w="7900"/>
+            <w:tcMar>
+              <w:top w:type="dxa" w:w="40"/>
+              <w:left w:type="dxa" w:w="80"/>
+              <w:bottom w:type="dxa" w:w="40"/>
+              <w:right w:type="dxa" w:w="80"/>
+            </w:tcMar>
+          </w:tcPr>
+          <w:p>
+            <w:r>
+              <w:rPr>
+                <w:sz w:val="20"/>
+                <w:szCs w:val="20"/>
+              </w:rPr>
+              <w:t xml:space="preserve">Phát hiện cluster — liệt kê cluster/vSAN/DRS, đánh dấu cluster chưa giám sát</w:t>
+            </w:r>
+          </w:p>
+        </w:tc>
+      </w:tr>
     </w:tbl>
     <w:p>
       <w:r>
@@ -4346,7 +4410,37 @@
         <w:spacing w:after="90"/>
       </w:pPr>
       <w:r>
-        <w:t xml:space="preserve">Dashboards → New → Import → upload grafana/esxi_host_resource_grafana.json → chọn datasource Prometheus → chọn Cluster. Đã có bản cũ thì chọn Overwrite.</w:t>
+        <w:t xml:space="preserve">Import dashboard: Dashboards → New → Import → Upload JSON → chọn file grafana/esxi_host_resource_grafana.json → chọn datasource Prometheus → Overwrite nếu đã có bản cũ. Chọn Cluster ở đầu trang.</w:t>
+      </w:r>
+    </w:p>
+    <w:p>
+      <w:pPr>
+        <w:spacing w:after="40"/>
+      </w:pPr>
+      <w:r>
+        <w:rPr>
+          <w:b/>
+          <w:bCs/>
+        </w:rPr>
+        <w:t xml:space="preserve">Ví dụ dashboard đang chạy:</w:t>
+      </w:r>
+    </w:p>
+    <w:p>
+      <w:pPr>
+        <w:pBdr>
+          <w:left w:val="single" w:color="1F4E79" w:sz="18" w:space="6"/>
+        </w:pBdr>
+        <w:shd w:fill="1E1E1E" w:val="clear"/>
+        <w:spacing w:after="120" w:before="40" w:line="240"/>
+      </w:pPr>
+      <w:r>
+        <w:rPr>
+          <w:rFonts w:ascii="Consolas" w:cs="Consolas" w:eastAsia="Consolas" w:hAnsi="Consolas"/>
+          <w:color w:val="E6EDF3"/>
+          <w:sz w:val="18"/>
+          <w:szCs w:val="18"/>
+        </w:rPr>
+        <w:t xml:space="preserve">https://42.117.4.233:3000/d/esxi-host-resource/</w:t>
       </w:r>
     </w:p>
     <w:p>
@@ -4359,7 +4453,7 @@
         <w:spacing w:after="60"/>
       </w:pPr>
       <w:r>
-        <w:t xml:space="preserve">Tổng quan: Total host / OK / Cảnh báo / Lỗi / vSAN resync / độ mới dữ liệu.</w:t>
+        <w:t xml:space="preserve">Tổng quan (8 ô): Total Hosts · OK · Warning (WARN) · Error (ERROR) · Hosts In Maintenance · Network Latency Max · vSAN Resync · Data Freshness.</w:t>
       </w:r>
     </w:p>
     <w:p>
@@ -4372,7 +4466,7 @@
         <w:spacing w:after="60"/>
       </w:pPr>
       <w:r>
-        <w:t xml:space="preserve">Bảng host: CPU% · RAM% · NIC UP (xanh) / NIC DOWN (đỏ) · DiskGroup vSAN · congestion · write latency · VMs · Uptime · Status · Lý do.</w:t>
+        <w:t xml:space="preserve">Bảng host: CPU% · RAM% · NIC UP (xanh) / NIC DOWN (đỏ) · DiskGroup vSAN · congestion · write latency · VMs · Uptime · Status · Alerts. Bấm tên host để lọc phần chi tiết.</w:t>
       </w:r>
     </w:p>
     <w:p>
@@ -4385,7 +4479,7 @@
         <w:spacing w:after="60"/>
       </w:pPr>
       <w:r>
-        <w:t xml:space="preserve">Network: bandwidth vmnic top 10, drop/discard vmk vSAN, vmnic DOWN.</w:t>
+        <w:t xml:space="preserve">Network: bandwidth vmnic TX/RX top 10, drop/discard vmk vSAN.</w:t>
       </w:r>
     </w:p>
     <w:p>
@@ -4398,7 +4492,20 @@
         <w:spacing w:after="60"/>
       </w:pPr>
       <w:r>
-        <w:t xml:space="preserve">Chi tiết host và vSAN Disk Health: từng disk, lịch sử trạng thái.</w:t>
+        <w:t xml:space="preserve">Chi tiết host (top 10 host): CPU, RAM, vSAN write / read / network latency — mỗi loại một biểu đồ riêng.</w:t>
+      </w:r>
+    </w:p>
+    <w:p>
+      <w:pPr>
+        <w:pStyle w:val="ListParagraph"/>
+        <w:numPr>
+          <w:ilvl w:val="0"/>
+          <w:numId w:val="2"/>
+        </w:numPr>
+        <w:spacing w:after="60"/>
+      </w:pPr>
+      <w:r>
+        <w:t xml:space="preserve">vSAN Disk Health: congestion, dung lượng, health từng disk.</w:t>
       </w:r>
     </w:p>
     <w:p>
@@ -4413,9 +4520,287 @@
           <w:bCs/>
           <w:color w:val="1F4E79"/>
         </w:rPr>
-        <w:t xml:space="preserve">7. Vận hành &amp; cập nhật</w:t>
+        <w:t xml:space="preserve">7. Zabbix (tùy chọn — thay / cùng Prometheus)</w:t>
       </w:r>
       <w:bookmarkEnd w:id="19"/>
+    </w:p>
+    <w:p>
+      <w:pPr>
+        <w:spacing w:after="90"/>
+      </w:pPr>
+      <w:r>
+        <w:t xml:space="preserve">Zabbix lấy thẳng /metrics của exporter bằng HTTP agent rồi tự phát hiện cluster/host/disk/nic/vmk (LLD) và tạo item + trigger + graph.</w:t>
+      </w:r>
+    </w:p>
+    <w:p>
+      <w:pPr>
+        <w:pStyle w:val="ListParagraph"/>
+        <w:numPr>
+          <w:ilvl w:val="0"/>
+          <w:numId w:val="3"/>
+        </w:numPr>
+        <w:spacing w:after="60"/>
+      </w:pPr>
+      <w:r>
+        <w:t xml:space="preserve">Data collection → Templates → Import → chọn zabbix/esxi_vsan_command_center.yaml (Zabbix 6.2).</w:t>
+      </w:r>
+    </w:p>
+    <w:p>
+      <w:pPr>
+        <w:pStyle w:val="ListParagraph"/>
+        <w:numPr>
+          <w:ilvl w:val="0"/>
+          <w:numId w:val="3"/>
+        </w:numPr>
+        <w:spacing w:after="60"/>
+      </w:pPr>
+      <w:r>
+        <w:t xml:space="preserve">Tạo 1 host Zabbix cho mỗi instance exporter, gán template ESXi Host Exporter by HTTP.</w:t>
+      </w:r>
+    </w:p>
+    <w:p>
+      <w:pPr>
+        <w:pStyle w:val="ListParagraph"/>
+        <w:numPr>
+          <w:ilvl w:val="0"/>
+          <w:numId w:val="3"/>
+        </w:numPr>
+        <w:spacing w:after="60"/>
+      </w:pPr>
+      <w:r>
+        <w:t xml:space="preserve">Sửa macro trên host:</w:t>
+      </w:r>
+    </w:p>
+    <w:tbl>
+      <w:tblPr>
+        <w:tblW w:type="dxa" w:w="8800"/>
+        <w:tblBorders>
+          <w:top w:val="single" w:color="C9D1D9" w:sz="4"/>
+          <w:left w:val="single" w:color="C9D1D9" w:sz="4"/>
+          <w:bottom w:val="single" w:color="C9D1D9" w:sz="4"/>
+          <w:right w:val="single" w:color="C9D1D9" w:sz="4"/>
+          <w:insideH w:val="single" w:color="C9D1D9" w:sz="4"/>
+          <w:insideV w:val="single" w:color="C9D1D9" w:sz="4"/>
+        </w:tblBorders>
+      </w:tblPr>
+      <w:tblGrid>
+        <w:gridCol w:w="3400"/>
+        <w:gridCol w:w="5400"/>
+      </w:tblGrid>
+      <w:tr>
+        <w:trPr>
+          <w:tblHeader/>
+        </w:trPr>
+        <w:tc>
+          <w:tcPr>
+            <w:tcW w:type="dxa" w:w="3400"/>
+            <w:shd w:fill="1F4E79" w:val="clear"/>
+            <w:tcMar>
+              <w:top w:type="dxa" w:w="40"/>
+              <w:left w:type="dxa" w:w="80"/>
+              <w:bottom w:type="dxa" w:w="40"/>
+              <w:right w:type="dxa" w:w="80"/>
+            </w:tcMar>
+          </w:tcPr>
+          <w:p>
+            <w:r>
+              <w:rPr>
+                <w:b/>
+                <w:bCs/>
+                <w:color w:val="FFFFFF"/>
+                <w:sz w:val="20"/>
+                <w:szCs w:val="20"/>
+              </w:rPr>
+              <w:t xml:space="preserve">Macro</w:t>
+            </w:r>
+          </w:p>
+        </w:tc>
+        <w:tc>
+          <w:tcPr>
+            <w:tcW w:type="dxa" w:w="5400"/>
+            <w:shd w:fill="1F4E79" w:val="clear"/>
+            <w:tcMar>
+              <w:top w:type="dxa" w:w="40"/>
+              <w:left w:type="dxa" w:w="80"/>
+              <w:bottom w:type="dxa" w:w="40"/>
+              <w:right w:type="dxa" w:w="80"/>
+            </w:tcMar>
+          </w:tcPr>
+          <w:p>
+            <w:r>
+              <w:rPr>
+                <w:b/>
+                <w:bCs/>
+                <w:color w:val="FFFFFF"/>
+                <w:sz w:val="20"/>
+                <w:szCs w:val="20"/>
+              </w:rPr>
+              <w:t xml:space="preserve">Giá trị</w:t>
+            </w:r>
+          </w:p>
+        </w:tc>
+      </w:tr>
+      <w:tr>
+        <w:tc>
+          <w:tcPr>
+            <w:tcW w:type="dxa" w:w="3400"/>
+            <w:tcMar>
+              <w:top w:type="dxa" w:w="40"/>
+              <w:left w:type="dxa" w:w="80"/>
+              <w:bottom w:type="dxa" w:w="40"/>
+              <w:right w:type="dxa" w:w="80"/>
+            </w:tcMar>
+          </w:tcPr>
+          <w:p>
+            <w:r>
+              <w:rPr>
+                <w:rFonts w:ascii="Consolas" w:cs="Consolas" w:eastAsia="Consolas" w:hAnsi="Consolas"/>
+                <w:sz w:val="18"/>
+                <w:szCs w:val="18"/>
+              </w:rPr>
+              <w:t xml:space="preserve">{$ESXI.EXPORTER.URL}</w:t>
+            </w:r>
+          </w:p>
+        </w:tc>
+        <w:tc>
+          <w:tcPr>
+            <w:tcW w:type="dxa" w:w="5400"/>
+            <w:tcMar>
+              <w:top w:type="dxa" w:w="40"/>
+              <w:left w:type="dxa" w:w="80"/>
+              <w:bottom w:type="dxa" w:w="40"/>
+              <w:right w:type="dxa" w:w="80"/>
+            </w:tcMar>
+          </w:tcPr>
+          <w:p>
+            <w:r>
+              <w:rPr>
+                <w:rFonts w:ascii="Consolas" w:cs="Consolas" w:eastAsia="Consolas" w:hAnsi="Consolas"/>
+                <w:sz w:val="18"/>
+                <w:szCs w:val="18"/>
+              </w:rPr>
+              <w:t xml:space="preserve">http://&lt;IP-server&gt;:&lt;port&gt;/metrics</w:t>
+            </w:r>
+          </w:p>
+        </w:tc>
+      </w:tr>
+      <w:tr>
+        <w:tc>
+          <w:tcPr>
+            <w:tcW w:type="dxa" w:w="3400"/>
+            <w:tcMar>
+              <w:top w:type="dxa" w:w="40"/>
+              <w:left w:type="dxa" w:w="80"/>
+              <w:bottom w:type="dxa" w:w="40"/>
+              <w:right w:type="dxa" w:w="80"/>
+            </w:tcMar>
+          </w:tcPr>
+          <w:p>
+            <w:r>
+              <w:rPr>
+                <w:rFonts w:ascii="Consolas" w:cs="Consolas" w:eastAsia="Consolas" w:hAnsi="Consolas"/>
+                <w:sz w:val="18"/>
+                <w:szCs w:val="18"/>
+              </w:rPr>
+              <w:t xml:space="preserve">{$ESXI.CLUSTER.MATCHES}</w:t>
+            </w:r>
+          </w:p>
+        </w:tc>
+        <w:tc>
+          <w:tcPr>
+            <w:tcW w:type="dxa" w:w="5400"/>
+            <w:tcMar>
+              <w:top w:type="dxa" w:w="40"/>
+              <w:left w:type="dxa" w:w="80"/>
+              <w:bottom w:type="dxa" w:w="40"/>
+              <w:right w:type="dxa" w:w="80"/>
+            </w:tcMar>
+          </w:tcPr>
+          <w:p>
+            <w:r>
+              <w:rPr>
+                <w:rFonts w:ascii="Consolas" w:cs="Consolas" w:eastAsia="Consolas" w:hAnsi="Consolas"/>
+                <w:sz w:val="18"/>
+                <w:szCs w:val="18"/>
+              </w:rPr>
+              <w:t xml:space="preserve">.*   (regex lọc cluster, vd ^POOL18-XD$)</w:t>
+            </w:r>
+          </w:p>
+        </w:tc>
+      </w:tr>
+      <w:tr>
+        <w:tc>
+          <w:tcPr>
+            <w:tcW w:type="dxa" w:w="3400"/>
+            <w:tcMar>
+              <w:top w:type="dxa" w:w="40"/>
+              <w:left w:type="dxa" w:w="80"/>
+              <w:bottom w:type="dxa" w:w="40"/>
+              <w:right w:type="dxa" w:w="80"/>
+            </w:tcMar>
+          </w:tcPr>
+          <w:p>
+            <w:r>
+              <w:rPr>
+                <w:rFonts w:ascii="Consolas" w:cs="Consolas" w:eastAsia="Consolas" w:hAnsi="Consolas"/>
+                <w:sz w:val="18"/>
+                <w:szCs w:val="18"/>
+              </w:rPr>
+              <w:t xml:space="preserve">{$ESXI.HOST.MATCHES}</w:t>
+            </w:r>
+          </w:p>
+        </w:tc>
+        <w:tc>
+          <w:tcPr>
+            <w:tcW w:type="dxa" w:w="5400"/>
+            <w:tcMar>
+              <w:top w:type="dxa" w:w="40"/>
+              <w:left w:type="dxa" w:w="80"/>
+              <w:bottom w:type="dxa" w:w="40"/>
+              <w:right w:type="dxa" w:w="80"/>
+            </w:tcMar>
+          </w:tcPr>
+          <w:p>
+            <w:r>
+              <w:rPr>
+                <w:rFonts w:ascii="Consolas" w:cs="Consolas" w:eastAsia="Consolas" w:hAnsi="Consolas"/>
+                <w:sz w:val="18"/>
+                <w:szCs w:val="18"/>
+              </w:rPr>
+              <w:t xml:space="preserve">.*   (regex lọc host)</w:t>
+            </w:r>
+          </w:p>
+        </w:tc>
+      </w:tr>
+    </w:tbl>
+    <w:p>
+      <w:pPr>
+        <w:spacing w:after="90"/>
+      </w:pPr>
+      <w:r>
+        <w:t xml:space="preserve">Có sẵn dashboard 3 trang (Hosts / vSAN / Network) trong template. Mức 2 = High, Mức 3 = Warning; ngưỡng đổi bằng macro {$ESXI.*} trên host/template, không cần sửa trigger.</w:t>
+      </w:r>
+    </w:p>
+    <w:p>
+      <w:r>
+        <w:br w:type="page"/>
+      </w:r>
+    </w:p>
+    <w:p>
+      <w:pPr>
+        <w:pStyle w:val="Heading1"/>
+        <w:spacing w:after="120" w:before="260"/>
+      </w:pPr>
+      <w:bookmarkStart w:name="_Toc20" w:id="20"/>
+      <w:r>
+        <w:rPr>
+          <w:b/>
+          <w:bCs/>
+          <w:color w:val="1F4E79"/>
+        </w:rPr>
+        <w:t xml:space="preserve">8. Vận hành &amp; cập nhật</w:t>
+      </w:r>
+      <w:bookmarkEnd w:id="20"/>
     </w:p>
     <w:tbl>
       <w:tblPr>
@@ -4879,16 +5264,16 @@
         <w:pStyle w:val="Heading1"/>
         <w:spacing w:after="120" w:before="260"/>
       </w:pPr>
-      <w:bookmarkStart w:name="_Toc20" w:id="20"/>
+      <w:bookmarkStart w:name="_Toc21" w:id="21"/>
       <w:r>
         <w:rPr>
           <w:b/>
           <w:bCs/>
           <w:color w:val="1F4E79"/>
         </w:rPr>
-        <w:t xml:space="preserve">8. Xử lý sự cố</w:t>
-      </w:r>
-      <w:bookmarkEnd w:id="20"/>
+        <w:t xml:space="preserve">9. Xử lý sự cố</w:t>
+      </w:r>
+      <w:bookmarkEnd w:id="21"/>
     </w:p>
     <w:tbl>
       <w:tblPr>
@@ -5217,16 +5602,16 @@
         <w:pStyle w:val="Heading1"/>
         <w:spacing w:after="120" w:before="260"/>
       </w:pPr>
-      <w:bookmarkStart w:name="_Toc21" w:id="21"/>
+      <w:bookmarkStart w:name="_Toc22" w:id="22"/>
       <w:r>
         <w:rPr>
           <w:b/>
           <w:bCs/>
           <w:color w:val="1F4E79"/>
         </w:rPr>
-        <w:t xml:space="preserve">9. Bảo mật</w:t>
-      </w:r>
-      <w:bookmarkEnd w:id="21"/>
+        <w:t xml:space="preserve">10. Bảo mật</w:t>
+      </w:r>
+      <w:bookmarkEnd w:id="22"/>
     </w:p>
     <w:p>
       <w:pPr>

</xml_diff>

<commit_message>
Docs: sinh lai .docx voi khoi lenh nen xanh
</commit_message>
<xml_diff>
--- a/docs/Huong-Dan-Cai-Dat-ESXi-Exporter.docx
+++ b/docs/Huong-Dan-Cai-Dat-ESXi-Exporter.docx
@@ -726,15 +726,18 @@
     <w:p>
       <w:pPr>
         <w:pBdr>
-          <w:left w:val="single" w:color="1F4E79" w:sz="18" w:space="6"/>
-        </w:pBdr>
-        <w:shd w:fill="1E1E1E" w:val="clear"/>
-        <w:spacing w:after="120" w:before="40" w:line="240"/>
-      </w:pPr>
-      <w:r>
-        <w:rPr>
-          <w:rFonts w:ascii="Consolas" w:cs="Consolas" w:eastAsia="Consolas" w:hAnsi="Consolas"/>
-          <w:color w:val="E6EDF3"/>
+          <w:top w:val="single" w:color="C9DDF2" w:sz="6" w:space="3"/>
+          <w:left w:val="single" w:color="2F6FB3" w:sz="24" w:space="10"/>
+          <w:bottom w:val="single" w:color="C9DDF2" w:sz="6" w:space="3"/>
+          <w:right w:val="single" w:color="C9DDF2" w:sz="6" w:space="3"/>
+        </w:pBdr>
+        <w:shd w:fill="EAF2FB" w:val="clear"/>
+        <w:spacing w:after="150" w:before="60" w:line="252"/>
+      </w:pPr>
+      <w:r>
+        <w:rPr>
+          <w:rFonts w:ascii="Consolas" w:cs="Consolas" w:eastAsia="Consolas" w:hAnsi="Consolas"/>
+          <w:color w:val="103D63"/>
           <w:sz w:val="18"/>
           <w:szCs w:val="18"/>
         </w:rPr>
@@ -808,15 +811,18 @@
     <w:p>
       <w:pPr>
         <w:pBdr>
-          <w:left w:val="single" w:color="1F4E79" w:sz="18" w:space="6"/>
-        </w:pBdr>
-        <w:shd w:fill="1E1E1E" w:val="clear"/>
-        <w:spacing w:after="120" w:before="40" w:line="240"/>
-      </w:pPr>
-      <w:r>
-        <w:rPr>
-          <w:rFonts w:ascii="Consolas" w:cs="Consolas" w:eastAsia="Consolas" w:hAnsi="Consolas"/>
-          <w:color w:val="E6EDF3"/>
+          <w:top w:val="single" w:color="C9DDF2" w:sz="6" w:space="3"/>
+          <w:left w:val="single" w:color="2F6FB3" w:sz="24" w:space="10"/>
+          <w:bottom w:val="single" w:color="C9DDF2" w:sz="6" w:space="3"/>
+          <w:right w:val="single" w:color="C9DDF2" w:sz="6" w:space="3"/>
+        </w:pBdr>
+        <w:shd w:fill="EAF2FB" w:val="clear"/>
+        <w:spacing w:after="150" w:before="60" w:line="252"/>
+      </w:pPr>
+      <w:r>
+        <w:rPr>
+          <w:rFonts w:ascii="Consolas" w:cs="Consolas" w:eastAsia="Consolas" w:hAnsi="Consolas"/>
+          <w:color w:val="103D63"/>
           <w:sz w:val="18"/>
           <w:szCs w:val="18"/>
         </w:rPr>
@@ -852,15 +858,17 @@
     <w:p>
       <w:pPr>
         <w:pBdr>
-          <w:left w:val="single" w:color="1F4E79" w:sz="18" w:space="6"/>
-        </w:pBdr>
-        <w:shd w:fill="1E1E1E" w:val="clear"/>
-        <w:spacing w:after="0" w:before="40" w:line="240"/>
-      </w:pPr>
-      <w:r>
-        <w:rPr>
-          <w:rFonts w:ascii="Consolas" w:cs="Consolas" w:eastAsia="Consolas" w:hAnsi="Consolas"/>
-          <w:color w:val="E6EDF3"/>
+          <w:top w:val="single" w:color="C9DDF2" w:sz="6" w:space="3"/>
+          <w:left w:val="single" w:color="2F6FB3" w:sz="24" w:space="10"/>
+          <w:right w:val="single" w:color="C9DDF2" w:sz="6" w:space="3"/>
+        </w:pBdr>
+        <w:shd w:fill="EAF2FB" w:val="clear"/>
+        <w:spacing w:after="0" w:before="60" w:line="252"/>
+      </w:pPr>
+      <w:r>
+        <w:rPr>
+          <w:rFonts w:ascii="Consolas" w:cs="Consolas" w:eastAsia="Consolas" w:hAnsi="Consolas"/>
+          <w:color w:val="103D63"/>
           <w:sz w:val="18"/>
           <w:szCs w:val="18"/>
         </w:rPr>
@@ -870,15 +878,16 @@
     <w:p>
       <w:pPr>
         <w:pBdr>
-          <w:left w:val="single" w:color="1F4E79" w:sz="18" w:space="6"/>
-        </w:pBdr>
-        <w:shd w:fill="1E1E1E" w:val="clear"/>
-        <w:spacing w:after="0" w:before="0" w:line="240"/>
-      </w:pPr>
-      <w:r>
-        <w:rPr>
-          <w:rFonts w:ascii="Consolas" w:cs="Consolas" w:eastAsia="Consolas" w:hAnsi="Consolas"/>
-          <w:color w:val="E6EDF3"/>
+          <w:left w:val="single" w:color="2F6FB3" w:sz="24" w:space="10"/>
+          <w:right w:val="single" w:color="C9DDF2" w:sz="6" w:space="3"/>
+        </w:pBdr>
+        <w:shd w:fill="EAF2FB" w:val="clear"/>
+        <w:spacing w:after="0" w:before="0" w:line="252"/>
+      </w:pPr>
+      <w:r>
+        <w:rPr>
+          <w:rFonts w:ascii="Consolas" w:cs="Consolas" w:eastAsia="Consolas" w:hAnsi="Consolas"/>
+          <w:color w:val="103D63"/>
           <w:sz w:val="18"/>
           <w:szCs w:val="18"/>
         </w:rPr>
@@ -888,15 +897,17 @@
     <w:p>
       <w:pPr>
         <w:pBdr>
-          <w:left w:val="single" w:color="1F4E79" w:sz="18" w:space="6"/>
-        </w:pBdr>
-        <w:shd w:fill="1E1E1E" w:val="clear"/>
-        <w:spacing w:after="120" w:before="0" w:line="240"/>
-      </w:pPr>
-      <w:r>
-        <w:rPr>
-          <w:rFonts w:ascii="Consolas" w:cs="Consolas" w:eastAsia="Consolas" w:hAnsi="Consolas"/>
-          <w:color w:val="E6EDF3"/>
+          <w:left w:val="single" w:color="2F6FB3" w:sz="24" w:space="10"/>
+          <w:bottom w:val="single" w:color="C9DDF2" w:sz="6" w:space="3"/>
+          <w:right w:val="single" w:color="C9DDF2" w:sz="6" w:space="3"/>
+        </w:pBdr>
+        <w:shd w:fill="EAF2FB" w:val="clear"/>
+        <w:spacing w:after="150" w:before="0" w:line="252"/>
+      </w:pPr>
+      <w:r>
+        <w:rPr>
+          <w:rFonts w:ascii="Consolas" w:cs="Consolas" w:eastAsia="Consolas" w:hAnsi="Consolas"/>
+          <w:color w:val="103D63"/>
           <w:sz w:val="18"/>
           <w:szCs w:val="18"/>
         </w:rPr>
@@ -921,15 +932,17 @@
     <w:p>
       <w:pPr>
         <w:pBdr>
-          <w:left w:val="single" w:color="1F4E79" w:sz="18" w:space="6"/>
-        </w:pBdr>
-        <w:shd w:fill="1E1E1E" w:val="clear"/>
-        <w:spacing w:after="0" w:before="40" w:line="240"/>
-      </w:pPr>
-      <w:r>
-        <w:rPr>
-          <w:rFonts w:ascii="Consolas" w:cs="Consolas" w:eastAsia="Consolas" w:hAnsi="Consolas"/>
-          <w:color w:val="E6EDF3"/>
+          <w:top w:val="single" w:color="C9DDF2" w:sz="6" w:space="3"/>
+          <w:left w:val="single" w:color="2F6FB3" w:sz="24" w:space="10"/>
+          <w:right w:val="single" w:color="C9DDF2" w:sz="6" w:space="3"/>
+        </w:pBdr>
+        <w:shd w:fill="EAF2FB" w:val="clear"/>
+        <w:spacing w:after="0" w:before="60" w:line="252"/>
+      </w:pPr>
+      <w:r>
+        <w:rPr>
+          <w:rFonts w:ascii="Consolas" w:cs="Consolas" w:eastAsia="Consolas" w:hAnsi="Consolas"/>
+          <w:color w:val="103D63"/>
           <w:sz w:val="18"/>
           <w:szCs w:val="18"/>
         </w:rPr>
@@ -939,15 +952,16 @@
     <w:p>
       <w:pPr>
         <w:pBdr>
-          <w:left w:val="single" w:color="1F4E79" w:sz="18" w:space="6"/>
-        </w:pBdr>
-        <w:shd w:fill="1E1E1E" w:val="clear"/>
-        <w:spacing w:after="0" w:before="0" w:line="240"/>
-      </w:pPr>
-      <w:r>
-        <w:rPr>
-          <w:rFonts w:ascii="Consolas" w:cs="Consolas" w:eastAsia="Consolas" w:hAnsi="Consolas"/>
-          <w:color w:val="E6EDF3"/>
+          <w:left w:val="single" w:color="2F6FB3" w:sz="24" w:space="10"/>
+          <w:right w:val="single" w:color="C9DDF2" w:sz="6" w:space="3"/>
+        </w:pBdr>
+        <w:shd w:fill="EAF2FB" w:val="clear"/>
+        <w:spacing w:after="0" w:before="0" w:line="252"/>
+      </w:pPr>
+      <w:r>
+        <w:rPr>
+          <w:rFonts w:ascii="Consolas" w:cs="Consolas" w:eastAsia="Consolas" w:hAnsi="Consolas"/>
+          <w:color w:val="103D63"/>
           <w:sz w:val="18"/>
           <w:szCs w:val="18"/>
         </w:rPr>
@@ -957,15 +971,16 @@
     <w:p>
       <w:pPr>
         <w:pBdr>
-          <w:left w:val="single" w:color="1F4E79" w:sz="18" w:space="6"/>
-        </w:pBdr>
-        <w:shd w:fill="1E1E1E" w:val="clear"/>
-        <w:spacing w:after="0" w:before="0" w:line="240"/>
-      </w:pPr>
-      <w:r>
-        <w:rPr>
-          <w:rFonts w:ascii="Consolas" w:cs="Consolas" w:eastAsia="Consolas" w:hAnsi="Consolas"/>
-          <w:color w:val="E6EDF3"/>
+          <w:left w:val="single" w:color="2F6FB3" w:sz="24" w:space="10"/>
+          <w:right w:val="single" w:color="C9DDF2" w:sz="6" w:space="3"/>
+        </w:pBdr>
+        <w:shd w:fill="EAF2FB" w:val="clear"/>
+        <w:spacing w:after="0" w:before="0" w:line="252"/>
+      </w:pPr>
+      <w:r>
+        <w:rPr>
+          <w:rFonts w:ascii="Consolas" w:cs="Consolas" w:eastAsia="Consolas" w:hAnsi="Consolas"/>
+          <w:color w:val="103D63"/>
           <w:sz w:val="18"/>
           <w:szCs w:val="18"/>
         </w:rPr>
@@ -975,15 +990,17 @@
     <w:p>
       <w:pPr>
         <w:pBdr>
-          <w:left w:val="single" w:color="1F4E79" w:sz="18" w:space="6"/>
-        </w:pBdr>
-        <w:shd w:fill="1E1E1E" w:val="clear"/>
-        <w:spacing w:after="120" w:before="0" w:line="240"/>
-      </w:pPr>
-      <w:r>
-        <w:rPr>
-          <w:rFonts w:ascii="Consolas" w:cs="Consolas" w:eastAsia="Consolas" w:hAnsi="Consolas"/>
-          <w:color w:val="E6EDF3"/>
+          <w:left w:val="single" w:color="2F6FB3" w:sz="24" w:space="10"/>
+          <w:bottom w:val="single" w:color="C9DDF2" w:sz="6" w:space="3"/>
+          <w:right w:val="single" w:color="C9DDF2" w:sz="6" w:space="3"/>
+        </w:pBdr>
+        <w:shd w:fill="EAF2FB" w:val="clear"/>
+        <w:spacing w:after="150" w:before="0" w:line="252"/>
+      </w:pPr>
+      <w:r>
+        <w:rPr>
+          <w:rFonts w:ascii="Consolas" w:cs="Consolas" w:eastAsia="Consolas" w:hAnsi="Consolas"/>
+          <w:color w:val="103D63"/>
           <w:sz w:val="18"/>
           <w:szCs w:val="18"/>
         </w:rPr>
@@ -1588,15 +1605,18 @@
     <w:p>
       <w:pPr>
         <w:pBdr>
-          <w:left w:val="single" w:color="1F4E79" w:sz="18" w:space="6"/>
-        </w:pBdr>
-        <w:shd w:fill="1E1E1E" w:val="clear"/>
-        <w:spacing w:after="120" w:before="40" w:line="240"/>
-      </w:pPr>
-      <w:r>
-        <w:rPr>
-          <w:rFonts w:ascii="Consolas" w:cs="Consolas" w:eastAsia="Consolas" w:hAnsi="Consolas"/>
-          <w:color w:val="E6EDF3"/>
+          <w:top w:val="single" w:color="C9DDF2" w:sz="6" w:space="3"/>
+          <w:left w:val="single" w:color="2F6FB3" w:sz="24" w:space="10"/>
+          <w:bottom w:val="single" w:color="C9DDF2" w:sz="6" w:space="3"/>
+          <w:right w:val="single" w:color="C9DDF2" w:sz="6" w:space="3"/>
+        </w:pBdr>
+        <w:shd w:fill="EAF2FB" w:val="clear"/>
+        <w:spacing w:after="150" w:before="60" w:line="252"/>
+      </w:pPr>
+      <w:r>
+        <w:rPr>
+          <w:rFonts w:ascii="Consolas" w:cs="Consolas" w:eastAsia="Consolas" w:hAnsi="Consolas"/>
+          <w:color w:val="103D63"/>
           <w:sz w:val="18"/>
           <w:szCs w:val="18"/>
         </w:rPr>
@@ -2354,15 +2374,18 @@
     <w:p>
       <w:pPr>
         <w:pBdr>
-          <w:left w:val="single" w:color="1F4E79" w:sz="18" w:space="6"/>
-        </w:pBdr>
-        <w:shd w:fill="1E1E1E" w:val="clear"/>
-        <w:spacing w:after="120" w:before="40" w:line="240"/>
-      </w:pPr>
-      <w:r>
-        <w:rPr>
-          <w:rFonts w:ascii="Consolas" w:cs="Consolas" w:eastAsia="Consolas" w:hAnsi="Consolas"/>
-          <w:color w:val="E6EDF3"/>
+          <w:top w:val="single" w:color="C9DDF2" w:sz="6" w:space="3"/>
+          <w:left w:val="single" w:color="2F6FB3" w:sz="24" w:space="10"/>
+          <w:bottom w:val="single" w:color="C9DDF2" w:sz="6" w:space="3"/>
+          <w:right w:val="single" w:color="C9DDF2" w:sz="6" w:space="3"/>
+        </w:pBdr>
+        <w:shd w:fill="EAF2FB" w:val="clear"/>
+        <w:spacing w:after="150" w:before="60" w:line="252"/>
+      </w:pPr>
+      <w:r>
+        <w:rPr>
+          <w:rFonts w:ascii="Consolas" w:cs="Consolas" w:eastAsia="Consolas" w:hAnsi="Consolas"/>
+          <w:color w:val="103D63"/>
           <w:sz w:val="18"/>
           <w:szCs w:val="18"/>
         </w:rPr>
@@ -2387,15 +2410,17 @@
     <w:p>
       <w:pPr>
         <w:pBdr>
-          <w:left w:val="single" w:color="1F4E79" w:sz="18" w:space="6"/>
-        </w:pBdr>
-        <w:shd w:fill="1E1E1E" w:val="clear"/>
-        <w:spacing w:after="0" w:before="40" w:line="240"/>
-      </w:pPr>
-      <w:r>
-        <w:rPr>
-          <w:rFonts w:ascii="Consolas" w:cs="Consolas" w:eastAsia="Consolas" w:hAnsi="Consolas"/>
-          <w:color w:val="E6EDF3"/>
+          <w:top w:val="single" w:color="C9DDF2" w:sz="6" w:space="3"/>
+          <w:left w:val="single" w:color="2F6FB3" w:sz="24" w:space="10"/>
+          <w:right w:val="single" w:color="C9DDF2" w:sz="6" w:space="3"/>
+        </w:pBdr>
+        <w:shd w:fill="EAF2FB" w:val="clear"/>
+        <w:spacing w:after="0" w:before="60" w:line="252"/>
+      </w:pPr>
+      <w:r>
+        <w:rPr>
+          <w:rFonts w:ascii="Consolas" w:cs="Consolas" w:eastAsia="Consolas" w:hAnsi="Consolas"/>
+          <w:color w:val="103D63"/>
           <w:sz w:val="18"/>
           <w:szCs w:val="18"/>
         </w:rPr>
@@ -2405,15 +2430,16 @@
     <w:p>
       <w:pPr>
         <w:pBdr>
-          <w:left w:val="single" w:color="1F4E79" w:sz="18" w:space="6"/>
-        </w:pBdr>
-        <w:shd w:fill="1E1E1E" w:val="clear"/>
-        <w:spacing w:after="0" w:before="0" w:line="240"/>
-      </w:pPr>
-      <w:r>
-        <w:rPr>
-          <w:rFonts w:ascii="Consolas" w:cs="Consolas" w:eastAsia="Consolas" w:hAnsi="Consolas"/>
-          <w:color w:val="E6EDF3"/>
+          <w:left w:val="single" w:color="2F6FB3" w:sz="24" w:space="10"/>
+          <w:right w:val="single" w:color="C9DDF2" w:sz="6" w:space="3"/>
+        </w:pBdr>
+        <w:shd w:fill="EAF2FB" w:val="clear"/>
+        <w:spacing w:after="0" w:before="0" w:line="252"/>
+      </w:pPr>
+      <w:r>
+        <w:rPr>
+          <w:rFonts w:ascii="Consolas" w:cs="Consolas" w:eastAsia="Consolas" w:hAnsi="Consolas"/>
+          <w:color w:val="103D63"/>
           <w:sz w:val="18"/>
           <w:szCs w:val="18"/>
         </w:rPr>
@@ -2423,15 +2449,16 @@
     <w:p>
       <w:pPr>
         <w:pBdr>
-          <w:left w:val="single" w:color="1F4E79" w:sz="18" w:space="6"/>
-        </w:pBdr>
-        <w:shd w:fill="1E1E1E" w:val="clear"/>
-        <w:spacing w:after="0" w:before="0" w:line="240"/>
-      </w:pPr>
-      <w:r>
-        <w:rPr>
-          <w:rFonts w:ascii="Consolas" w:cs="Consolas" w:eastAsia="Consolas" w:hAnsi="Consolas"/>
-          <w:color w:val="E6EDF3"/>
+          <w:left w:val="single" w:color="2F6FB3" w:sz="24" w:space="10"/>
+          <w:right w:val="single" w:color="C9DDF2" w:sz="6" w:space="3"/>
+        </w:pBdr>
+        <w:shd w:fill="EAF2FB" w:val="clear"/>
+        <w:spacing w:after="0" w:before="0" w:line="252"/>
+      </w:pPr>
+      <w:r>
+        <w:rPr>
+          <w:rFonts w:ascii="Consolas" w:cs="Consolas" w:eastAsia="Consolas" w:hAnsi="Consolas"/>
+          <w:color w:val="103D63"/>
           <w:sz w:val="18"/>
           <w:szCs w:val="18"/>
         </w:rPr>
@@ -2441,15 +2468,16 @@
     <w:p>
       <w:pPr>
         <w:pBdr>
-          <w:left w:val="single" w:color="1F4E79" w:sz="18" w:space="6"/>
-        </w:pBdr>
-        <w:shd w:fill="1E1E1E" w:val="clear"/>
-        <w:spacing w:after="0" w:before="0" w:line="240"/>
-      </w:pPr>
-      <w:r>
-        <w:rPr>
-          <w:rFonts w:ascii="Consolas" w:cs="Consolas" w:eastAsia="Consolas" w:hAnsi="Consolas"/>
-          <w:color w:val="E6EDF3"/>
+          <w:left w:val="single" w:color="2F6FB3" w:sz="24" w:space="10"/>
+          <w:right w:val="single" w:color="C9DDF2" w:sz="6" w:space="3"/>
+        </w:pBdr>
+        <w:shd w:fill="EAF2FB" w:val="clear"/>
+        <w:spacing w:after="0" w:before="0" w:line="252"/>
+      </w:pPr>
+      <w:r>
+        <w:rPr>
+          <w:rFonts w:ascii="Consolas" w:cs="Consolas" w:eastAsia="Consolas" w:hAnsi="Consolas"/>
+          <w:color w:val="103D63"/>
           <w:sz w:val="18"/>
           <w:szCs w:val="18"/>
         </w:rPr>
@@ -2459,15 +2487,16 @@
     <w:p>
       <w:pPr>
         <w:pBdr>
-          <w:left w:val="single" w:color="1F4E79" w:sz="18" w:space="6"/>
-        </w:pBdr>
-        <w:shd w:fill="1E1E1E" w:val="clear"/>
-        <w:spacing w:after="0" w:before="0" w:line="240"/>
-      </w:pPr>
-      <w:r>
-        <w:rPr>
-          <w:rFonts w:ascii="Consolas" w:cs="Consolas" w:eastAsia="Consolas" w:hAnsi="Consolas"/>
-          <w:color w:val="E6EDF3"/>
+          <w:left w:val="single" w:color="2F6FB3" w:sz="24" w:space="10"/>
+          <w:right w:val="single" w:color="C9DDF2" w:sz="6" w:space="3"/>
+        </w:pBdr>
+        <w:shd w:fill="EAF2FB" w:val="clear"/>
+        <w:spacing w:after="0" w:before="0" w:line="252"/>
+      </w:pPr>
+      <w:r>
+        <w:rPr>
+          <w:rFonts w:ascii="Consolas" w:cs="Consolas" w:eastAsia="Consolas" w:hAnsi="Consolas"/>
+          <w:color w:val="103D63"/>
           <w:sz w:val="18"/>
           <w:szCs w:val="18"/>
         </w:rPr>
@@ -2477,15 +2506,16 @@
     <w:p>
       <w:pPr>
         <w:pBdr>
-          <w:left w:val="single" w:color="1F4E79" w:sz="18" w:space="6"/>
-        </w:pBdr>
-        <w:shd w:fill="1E1E1E" w:val="clear"/>
-        <w:spacing w:after="0" w:before="0" w:line="240"/>
-      </w:pPr>
-      <w:r>
-        <w:rPr>
-          <w:rFonts w:ascii="Consolas" w:cs="Consolas" w:eastAsia="Consolas" w:hAnsi="Consolas"/>
-          <w:color w:val="E6EDF3"/>
+          <w:left w:val="single" w:color="2F6FB3" w:sz="24" w:space="10"/>
+          <w:right w:val="single" w:color="C9DDF2" w:sz="6" w:space="3"/>
+        </w:pBdr>
+        <w:shd w:fill="EAF2FB" w:val="clear"/>
+        <w:spacing w:after="0" w:before="0" w:line="252"/>
+      </w:pPr>
+      <w:r>
+        <w:rPr>
+          <w:rFonts w:ascii="Consolas" w:cs="Consolas" w:eastAsia="Consolas" w:hAnsi="Consolas"/>
+          <w:color w:val="103D63"/>
           <w:sz w:val="18"/>
           <w:szCs w:val="18"/>
         </w:rPr>
@@ -2495,15 +2525,16 @@
     <w:p>
       <w:pPr>
         <w:pBdr>
-          <w:left w:val="single" w:color="1F4E79" w:sz="18" w:space="6"/>
-        </w:pBdr>
-        <w:shd w:fill="1E1E1E" w:val="clear"/>
-        <w:spacing w:after="0" w:before="0" w:line="240"/>
-      </w:pPr>
-      <w:r>
-        <w:rPr>
-          <w:rFonts w:ascii="Consolas" w:cs="Consolas" w:eastAsia="Consolas" w:hAnsi="Consolas"/>
-          <w:color w:val="E6EDF3"/>
+          <w:left w:val="single" w:color="2F6FB3" w:sz="24" w:space="10"/>
+          <w:right w:val="single" w:color="C9DDF2" w:sz="6" w:space="3"/>
+        </w:pBdr>
+        <w:shd w:fill="EAF2FB" w:val="clear"/>
+        <w:spacing w:after="0" w:before="0" w:line="252"/>
+      </w:pPr>
+      <w:r>
+        <w:rPr>
+          <w:rFonts w:ascii="Consolas" w:cs="Consolas" w:eastAsia="Consolas" w:hAnsi="Consolas"/>
+          <w:color w:val="103D63"/>
           <w:sz w:val="18"/>
           <w:szCs w:val="18"/>
         </w:rPr>
@@ -2513,15 +2544,16 @@
     <w:p>
       <w:pPr>
         <w:pBdr>
-          <w:left w:val="single" w:color="1F4E79" w:sz="18" w:space="6"/>
-        </w:pBdr>
-        <w:shd w:fill="1E1E1E" w:val="clear"/>
-        <w:spacing w:after="0" w:before="0" w:line="240"/>
-      </w:pPr>
-      <w:r>
-        <w:rPr>
-          <w:rFonts w:ascii="Consolas" w:cs="Consolas" w:eastAsia="Consolas" w:hAnsi="Consolas"/>
-          <w:color w:val="E6EDF3"/>
+          <w:left w:val="single" w:color="2F6FB3" w:sz="24" w:space="10"/>
+          <w:right w:val="single" w:color="C9DDF2" w:sz="6" w:space="3"/>
+        </w:pBdr>
+        <w:shd w:fill="EAF2FB" w:val="clear"/>
+        <w:spacing w:after="0" w:before="0" w:line="252"/>
+      </w:pPr>
+      <w:r>
+        <w:rPr>
+          <w:rFonts w:ascii="Consolas" w:cs="Consolas" w:eastAsia="Consolas" w:hAnsi="Consolas"/>
+          <w:color w:val="103D63"/>
           <w:sz w:val="18"/>
           <w:szCs w:val="18"/>
         </w:rPr>
@@ -2531,15 +2563,16 @@
     <w:p>
       <w:pPr>
         <w:pBdr>
-          <w:left w:val="single" w:color="1F4E79" w:sz="18" w:space="6"/>
-        </w:pBdr>
-        <w:shd w:fill="1E1E1E" w:val="clear"/>
-        <w:spacing w:after="0" w:before="0" w:line="240"/>
-      </w:pPr>
-      <w:r>
-        <w:rPr>
-          <w:rFonts w:ascii="Consolas" w:cs="Consolas" w:eastAsia="Consolas" w:hAnsi="Consolas"/>
-          <w:color w:val="E6EDF3"/>
+          <w:left w:val="single" w:color="2F6FB3" w:sz="24" w:space="10"/>
+          <w:right w:val="single" w:color="C9DDF2" w:sz="6" w:space="3"/>
+        </w:pBdr>
+        <w:shd w:fill="EAF2FB" w:val="clear"/>
+        <w:spacing w:after="0" w:before="0" w:line="252"/>
+      </w:pPr>
+      <w:r>
+        <w:rPr>
+          <w:rFonts w:ascii="Consolas" w:cs="Consolas" w:eastAsia="Consolas" w:hAnsi="Consolas"/>
+          <w:color w:val="103D63"/>
           <w:sz w:val="18"/>
           <w:szCs w:val="18"/>
         </w:rPr>
@@ -2549,15 +2582,16 @@
     <w:p>
       <w:pPr>
         <w:pBdr>
-          <w:left w:val="single" w:color="1F4E79" w:sz="18" w:space="6"/>
-        </w:pBdr>
-        <w:shd w:fill="1E1E1E" w:val="clear"/>
-        <w:spacing w:after="0" w:before="0" w:line="240"/>
-      </w:pPr>
-      <w:r>
-        <w:rPr>
-          <w:rFonts w:ascii="Consolas" w:cs="Consolas" w:eastAsia="Consolas" w:hAnsi="Consolas"/>
-          <w:color w:val="E6EDF3"/>
+          <w:left w:val="single" w:color="2F6FB3" w:sz="24" w:space="10"/>
+          <w:right w:val="single" w:color="C9DDF2" w:sz="6" w:space="3"/>
+        </w:pBdr>
+        <w:shd w:fill="EAF2FB" w:val="clear"/>
+        <w:spacing w:after="0" w:before="0" w:line="252"/>
+      </w:pPr>
+      <w:r>
+        <w:rPr>
+          <w:rFonts w:ascii="Consolas" w:cs="Consolas" w:eastAsia="Consolas" w:hAnsi="Consolas"/>
+          <w:color w:val="103D63"/>
           <w:sz w:val="18"/>
           <w:szCs w:val="18"/>
         </w:rPr>
@@ -2567,15 +2601,17 @@
     <w:p>
       <w:pPr>
         <w:pBdr>
-          <w:left w:val="single" w:color="1F4E79" w:sz="18" w:space="6"/>
-        </w:pBdr>
-        <w:shd w:fill="1E1E1E" w:val="clear"/>
-        <w:spacing w:after="120" w:before="0" w:line="240"/>
-      </w:pPr>
-      <w:r>
-        <w:rPr>
-          <w:rFonts w:ascii="Consolas" w:cs="Consolas" w:eastAsia="Consolas" w:hAnsi="Consolas"/>
-          <w:color w:val="E6EDF3"/>
+          <w:left w:val="single" w:color="2F6FB3" w:sz="24" w:space="10"/>
+          <w:bottom w:val="single" w:color="C9DDF2" w:sz="6" w:space="3"/>
+          <w:right w:val="single" w:color="C9DDF2" w:sz="6" w:space="3"/>
+        </w:pBdr>
+        <w:shd w:fill="EAF2FB" w:val="clear"/>
+        <w:spacing w:after="150" w:before="0" w:line="252"/>
+      </w:pPr>
+      <w:r>
+        <w:rPr>
+          <w:rFonts w:ascii="Consolas" w:cs="Consolas" w:eastAsia="Consolas" w:hAnsi="Consolas"/>
+          <w:color w:val="103D63"/>
           <w:sz w:val="18"/>
           <w:szCs w:val="18"/>
         </w:rPr>
@@ -2593,15 +2629,17 @@
     <w:p>
       <w:pPr>
         <w:pBdr>
-          <w:left w:val="single" w:color="1F4E79" w:sz="18" w:space="6"/>
-        </w:pBdr>
-        <w:shd w:fill="1E1E1E" w:val="clear"/>
-        <w:spacing w:after="0" w:before="40" w:line="240"/>
-      </w:pPr>
-      <w:r>
-        <w:rPr>
-          <w:rFonts w:ascii="Consolas" w:cs="Consolas" w:eastAsia="Consolas" w:hAnsi="Consolas"/>
-          <w:color w:val="E6EDF3"/>
+          <w:top w:val="single" w:color="C9DDF2" w:sz="6" w:space="3"/>
+          <w:left w:val="single" w:color="2F6FB3" w:sz="24" w:space="10"/>
+          <w:right w:val="single" w:color="C9DDF2" w:sz="6" w:space="3"/>
+        </w:pBdr>
+        <w:shd w:fill="EAF2FB" w:val="clear"/>
+        <w:spacing w:after="0" w:before="60" w:line="252"/>
+      </w:pPr>
+      <w:r>
+        <w:rPr>
+          <w:rFonts w:ascii="Consolas" w:cs="Consolas" w:eastAsia="Consolas" w:hAnsi="Consolas"/>
+          <w:color w:val="103D63"/>
           <w:sz w:val="18"/>
           <w:szCs w:val="18"/>
         </w:rPr>
@@ -2611,15 +2649,17 @@
     <w:p>
       <w:pPr>
         <w:pBdr>
-          <w:left w:val="single" w:color="1F4E79" w:sz="18" w:space="6"/>
-        </w:pBdr>
-        <w:shd w:fill="1E1E1E" w:val="clear"/>
-        <w:spacing w:after="120" w:before="0" w:line="240"/>
-      </w:pPr>
-      <w:r>
-        <w:rPr>
-          <w:rFonts w:ascii="Consolas" w:cs="Consolas" w:eastAsia="Consolas" w:hAnsi="Consolas"/>
-          <w:color w:val="E6EDF3"/>
+          <w:left w:val="single" w:color="2F6FB3" w:sz="24" w:space="10"/>
+          <w:bottom w:val="single" w:color="C9DDF2" w:sz="6" w:space="3"/>
+          <w:right w:val="single" w:color="C9DDF2" w:sz="6" w:space="3"/>
+        </w:pBdr>
+        <w:shd w:fill="EAF2FB" w:val="clear"/>
+        <w:spacing w:after="150" w:before="0" w:line="252"/>
+      </w:pPr>
+      <w:r>
+        <w:rPr>
+          <w:rFonts w:ascii="Consolas" w:cs="Consolas" w:eastAsia="Consolas" w:hAnsi="Consolas"/>
+          <w:color w:val="103D63"/>
           <w:sz w:val="18"/>
           <w:szCs w:val="18"/>
         </w:rPr>
@@ -2652,15 +2692,17 @@
     <w:p>
       <w:pPr>
         <w:pBdr>
-          <w:left w:val="single" w:color="1F4E79" w:sz="18" w:space="6"/>
-        </w:pBdr>
-        <w:shd w:fill="1E1E1E" w:val="clear"/>
-        <w:spacing w:after="0" w:before="40" w:line="240"/>
-      </w:pPr>
-      <w:r>
-        <w:rPr>
-          <w:rFonts w:ascii="Consolas" w:cs="Consolas" w:eastAsia="Consolas" w:hAnsi="Consolas"/>
-          <w:color w:val="E6EDF3"/>
+          <w:top w:val="single" w:color="C9DDF2" w:sz="6" w:space="3"/>
+          <w:left w:val="single" w:color="2F6FB3" w:sz="24" w:space="10"/>
+          <w:right w:val="single" w:color="C9DDF2" w:sz="6" w:space="3"/>
+        </w:pBdr>
+        <w:shd w:fill="EAF2FB" w:val="clear"/>
+        <w:spacing w:after="0" w:before="60" w:line="252"/>
+      </w:pPr>
+      <w:r>
+        <w:rPr>
+          <w:rFonts w:ascii="Consolas" w:cs="Consolas" w:eastAsia="Consolas" w:hAnsi="Consolas"/>
+          <w:color w:val="103D63"/>
           <w:sz w:val="18"/>
           <w:szCs w:val="18"/>
         </w:rPr>
@@ -2670,15 +2712,16 @@
     <w:p>
       <w:pPr>
         <w:pBdr>
-          <w:left w:val="single" w:color="1F4E79" w:sz="18" w:space="6"/>
-        </w:pBdr>
-        <w:shd w:fill="1E1E1E" w:val="clear"/>
-        <w:spacing w:after="0" w:before="0" w:line="240"/>
-      </w:pPr>
-      <w:r>
-        <w:rPr>
-          <w:rFonts w:ascii="Consolas" w:cs="Consolas" w:eastAsia="Consolas" w:hAnsi="Consolas"/>
-          <w:color w:val="E6EDF3"/>
+          <w:left w:val="single" w:color="2F6FB3" w:sz="24" w:space="10"/>
+          <w:right w:val="single" w:color="C9DDF2" w:sz="6" w:space="3"/>
+        </w:pBdr>
+        <w:shd w:fill="EAF2FB" w:val="clear"/>
+        <w:spacing w:after="0" w:before="0" w:line="252"/>
+      </w:pPr>
+      <w:r>
+        <w:rPr>
+          <w:rFonts w:ascii="Consolas" w:cs="Consolas" w:eastAsia="Consolas" w:hAnsi="Consolas"/>
+          <w:color w:val="103D63"/>
           <w:sz w:val="18"/>
           <w:szCs w:val="18"/>
         </w:rPr>
@@ -2688,15 +2731,16 @@
     <w:p>
       <w:pPr>
         <w:pBdr>
-          <w:left w:val="single" w:color="1F4E79" w:sz="18" w:space="6"/>
-        </w:pBdr>
-        <w:shd w:fill="1E1E1E" w:val="clear"/>
-        <w:spacing w:after="0" w:before="0" w:line="240"/>
-      </w:pPr>
-      <w:r>
-        <w:rPr>
-          <w:rFonts w:ascii="Consolas" w:cs="Consolas" w:eastAsia="Consolas" w:hAnsi="Consolas"/>
-          <w:color w:val="E6EDF3"/>
+          <w:left w:val="single" w:color="2F6FB3" w:sz="24" w:space="10"/>
+          <w:right w:val="single" w:color="C9DDF2" w:sz="6" w:space="3"/>
+        </w:pBdr>
+        <w:shd w:fill="EAF2FB" w:val="clear"/>
+        <w:spacing w:after="0" w:before="0" w:line="252"/>
+      </w:pPr>
+      <w:r>
+        <w:rPr>
+          <w:rFonts w:ascii="Consolas" w:cs="Consolas" w:eastAsia="Consolas" w:hAnsi="Consolas"/>
+          <w:color w:val="103D63"/>
           <w:sz w:val="18"/>
           <w:szCs w:val="18"/>
         </w:rPr>
@@ -2706,15 +2750,16 @@
     <w:p>
       <w:pPr>
         <w:pBdr>
-          <w:left w:val="single" w:color="1F4E79" w:sz="18" w:space="6"/>
-        </w:pBdr>
-        <w:shd w:fill="1E1E1E" w:val="clear"/>
-        <w:spacing w:after="0" w:before="0" w:line="240"/>
-      </w:pPr>
-      <w:r>
-        <w:rPr>
-          <w:rFonts w:ascii="Consolas" w:cs="Consolas" w:eastAsia="Consolas" w:hAnsi="Consolas"/>
-          <w:color w:val="E6EDF3"/>
+          <w:left w:val="single" w:color="2F6FB3" w:sz="24" w:space="10"/>
+          <w:right w:val="single" w:color="C9DDF2" w:sz="6" w:space="3"/>
+        </w:pBdr>
+        <w:shd w:fill="EAF2FB" w:val="clear"/>
+        <w:spacing w:after="0" w:before="0" w:line="252"/>
+      </w:pPr>
+      <w:r>
+        <w:rPr>
+          <w:rFonts w:ascii="Consolas" w:cs="Consolas" w:eastAsia="Consolas" w:hAnsi="Consolas"/>
+          <w:color w:val="103D63"/>
           <w:sz w:val="18"/>
           <w:szCs w:val="18"/>
         </w:rPr>
@@ -2724,15 +2769,16 @@
     <w:p>
       <w:pPr>
         <w:pBdr>
-          <w:left w:val="single" w:color="1F4E79" w:sz="18" w:space="6"/>
-        </w:pBdr>
-        <w:shd w:fill="1E1E1E" w:val="clear"/>
-        <w:spacing w:after="0" w:before="0" w:line="240"/>
-      </w:pPr>
-      <w:r>
-        <w:rPr>
-          <w:rFonts w:ascii="Consolas" w:cs="Consolas" w:eastAsia="Consolas" w:hAnsi="Consolas"/>
-          <w:color w:val="E6EDF3"/>
+          <w:left w:val="single" w:color="2F6FB3" w:sz="24" w:space="10"/>
+          <w:right w:val="single" w:color="C9DDF2" w:sz="6" w:space="3"/>
+        </w:pBdr>
+        <w:shd w:fill="EAF2FB" w:val="clear"/>
+        <w:spacing w:after="0" w:before="0" w:line="252"/>
+      </w:pPr>
+      <w:r>
+        <w:rPr>
+          <w:rFonts w:ascii="Consolas" w:cs="Consolas" w:eastAsia="Consolas" w:hAnsi="Consolas"/>
+          <w:color w:val="103D63"/>
           <w:sz w:val="18"/>
           <w:szCs w:val="18"/>
         </w:rPr>
@@ -2742,15 +2788,16 @@
     <w:p>
       <w:pPr>
         <w:pBdr>
-          <w:left w:val="single" w:color="1F4E79" w:sz="18" w:space="6"/>
-        </w:pBdr>
-        <w:shd w:fill="1E1E1E" w:val="clear"/>
-        <w:spacing w:after="0" w:before="0" w:line="240"/>
-      </w:pPr>
-      <w:r>
-        <w:rPr>
-          <w:rFonts w:ascii="Consolas" w:cs="Consolas" w:eastAsia="Consolas" w:hAnsi="Consolas"/>
-          <w:color w:val="E6EDF3"/>
+          <w:left w:val="single" w:color="2F6FB3" w:sz="24" w:space="10"/>
+          <w:right w:val="single" w:color="C9DDF2" w:sz="6" w:space="3"/>
+        </w:pBdr>
+        <w:shd w:fill="EAF2FB" w:val="clear"/>
+        <w:spacing w:after="0" w:before="0" w:line="252"/>
+      </w:pPr>
+      <w:r>
+        <w:rPr>
+          <w:rFonts w:ascii="Consolas" w:cs="Consolas" w:eastAsia="Consolas" w:hAnsi="Consolas"/>
+          <w:color w:val="103D63"/>
           <w:sz w:val="18"/>
           <w:szCs w:val="18"/>
         </w:rPr>
@@ -2760,15 +2807,16 @@
     <w:p>
       <w:pPr>
         <w:pBdr>
-          <w:left w:val="single" w:color="1F4E79" w:sz="18" w:space="6"/>
-        </w:pBdr>
-        <w:shd w:fill="1E1E1E" w:val="clear"/>
-        <w:spacing w:after="0" w:before="0" w:line="240"/>
-      </w:pPr>
-      <w:r>
-        <w:rPr>
-          <w:rFonts w:ascii="Consolas" w:cs="Consolas" w:eastAsia="Consolas" w:hAnsi="Consolas"/>
-          <w:color w:val="E6EDF3"/>
+          <w:left w:val="single" w:color="2F6FB3" w:sz="24" w:space="10"/>
+          <w:right w:val="single" w:color="C9DDF2" w:sz="6" w:space="3"/>
+        </w:pBdr>
+        <w:shd w:fill="EAF2FB" w:val="clear"/>
+        <w:spacing w:after="0" w:before="0" w:line="252"/>
+      </w:pPr>
+      <w:r>
+        <w:rPr>
+          <w:rFonts w:ascii="Consolas" w:cs="Consolas" w:eastAsia="Consolas" w:hAnsi="Consolas"/>
+          <w:color w:val="103D63"/>
           <w:sz w:val="18"/>
           <w:szCs w:val="18"/>
         </w:rPr>
@@ -2778,15 +2826,16 @@
     <w:p>
       <w:pPr>
         <w:pBdr>
-          <w:left w:val="single" w:color="1F4E79" w:sz="18" w:space="6"/>
-        </w:pBdr>
-        <w:shd w:fill="1E1E1E" w:val="clear"/>
-        <w:spacing w:after="0" w:before="0" w:line="240"/>
-      </w:pPr>
-      <w:r>
-        <w:rPr>
-          <w:rFonts w:ascii="Consolas" w:cs="Consolas" w:eastAsia="Consolas" w:hAnsi="Consolas"/>
-          <w:color w:val="E6EDF3"/>
+          <w:left w:val="single" w:color="2F6FB3" w:sz="24" w:space="10"/>
+          <w:right w:val="single" w:color="C9DDF2" w:sz="6" w:space="3"/>
+        </w:pBdr>
+        <w:shd w:fill="EAF2FB" w:val="clear"/>
+        <w:spacing w:after="0" w:before="0" w:line="252"/>
+      </w:pPr>
+      <w:r>
+        <w:rPr>
+          <w:rFonts w:ascii="Consolas" w:cs="Consolas" w:eastAsia="Consolas" w:hAnsi="Consolas"/>
+          <w:color w:val="103D63"/>
           <w:sz w:val="18"/>
           <w:szCs w:val="18"/>
         </w:rPr>
@@ -2796,15 +2845,16 @@
     <w:p>
       <w:pPr>
         <w:pBdr>
-          <w:left w:val="single" w:color="1F4E79" w:sz="18" w:space="6"/>
-        </w:pBdr>
-        <w:shd w:fill="1E1E1E" w:val="clear"/>
-        <w:spacing w:after="0" w:before="0" w:line="240"/>
-      </w:pPr>
-      <w:r>
-        <w:rPr>
-          <w:rFonts w:ascii="Consolas" w:cs="Consolas" w:eastAsia="Consolas" w:hAnsi="Consolas"/>
-          <w:color w:val="E6EDF3"/>
+          <w:left w:val="single" w:color="2F6FB3" w:sz="24" w:space="10"/>
+          <w:right w:val="single" w:color="C9DDF2" w:sz="6" w:space="3"/>
+        </w:pBdr>
+        <w:shd w:fill="EAF2FB" w:val="clear"/>
+        <w:spacing w:after="0" w:before="0" w:line="252"/>
+      </w:pPr>
+      <w:r>
+        <w:rPr>
+          <w:rFonts w:ascii="Consolas" w:cs="Consolas" w:eastAsia="Consolas" w:hAnsi="Consolas"/>
+          <w:color w:val="103D63"/>
           <w:sz w:val="18"/>
           <w:szCs w:val="18"/>
         </w:rPr>
@@ -2814,15 +2864,16 @@
     <w:p>
       <w:pPr>
         <w:pBdr>
-          <w:left w:val="single" w:color="1F4E79" w:sz="18" w:space="6"/>
-        </w:pBdr>
-        <w:shd w:fill="1E1E1E" w:val="clear"/>
-        <w:spacing w:after="0" w:before="0" w:line="240"/>
-      </w:pPr>
-      <w:r>
-        <w:rPr>
-          <w:rFonts w:ascii="Consolas" w:cs="Consolas" w:eastAsia="Consolas" w:hAnsi="Consolas"/>
-          <w:color w:val="E6EDF3"/>
+          <w:left w:val="single" w:color="2F6FB3" w:sz="24" w:space="10"/>
+          <w:right w:val="single" w:color="C9DDF2" w:sz="6" w:space="3"/>
+        </w:pBdr>
+        <w:shd w:fill="EAF2FB" w:val="clear"/>
+        <w:spacing w:after="0" w:before="0" w:line="252"/>
+      </w:pPr>
+      <w:r>
+        <w:rPr>
+          <w:rFonts w:ascii="Consolas" w:cs="Consolas" w:eastAsia="Consolas" w:hAnsi="Consolas"/>
+          <w:color w:val="103D63"/>
           <w:sz w:val="18"/>
           <w:szCs w:val="18"/>
         </w:rPr>
@@ -2832,15 +2883,16 @@
     <w:p>
       <w:pPr>
         <w:pBdr>
-          <w:left w:val="single" w:color="1F4E79" w:sz="18" w:space="6"/>
-        </w:pBdr>
-        <w:shd w:fill="1E1E1E" w:val="clear"/>
-        <w:spacing w:after="0" w:before="0" w:line="240"/>
-      </w:pPr>
-      <w:r>
-        <w:rPr>
-          <w:rFonts w:ascii="Consolas" w:cs="Consolas" w:eastAsia="Consolas" w:hAnsi="Consolas"/>
-          <w:color w:val="E6EDF3"/>
+          <w:left w:val="single" w:color="2F6FB3" w:sz="24" w:space="10"/>
+          <w:right w:val="single" w:color="C9DDF2" w:sz="6" w:space="3"/>
+        </w:pBdr>
+        <w:shd w:fill="EAF2FB" w:val="clear"/>
+        <w:spacing w:after="0" w:before="0" w:line="252"/>
+      </w:pPr>
+      <w:r>
+        <w:rPr>
+          <w:rFonts w:ascii="Consolas" w:cs="Consolas" w:eastAsia="Consolas" w:hAnsi="Consolas"/>
+          <w:color w:val="103D63"/>
           <w:sz w:val="18"/>
           <w:szCs w:val="18"/>
         </w:rPr>
@@ -2850,15 +2902,16 @@
     <w:p>
       <w:pPr>
         <w:pBdr>
-          <w:left w:val="single" w:color="1F4E79" w:sz="18" w:space="6"/>
-        </w:pBdr>
-        <w:shd w:fill="1E1E1E" w:val="clear"/>
-        <w:spacing w:after="0" w:before="0" w:line="240"/>
-      </w:pPr>
-      <w:r>
-        <w:rPr>
-          <w:rFonts w:ascii="Consolas" w:cs="Consolas" w:eastAsia="Consolas" w:hAnsi="Consolas"/>
-          <w:color w:val="E6EDF3"/>
+          <w:left w:val="single" w:color="2F6FB3" w:sz="24" w:space="10"/>
+          <w:right w:val="single" w:color="C9DDF2" w:sz="6" w:space="3"/>
+        </w:pBdr>
+        <w:shd w:fill="EAF2FB" w:val="clear"/>
+        <w:spacing w:after="0" w:before="0" w:line="252"/>
+      </w:pPr>
+      <w:r>
+        <w:rPr>
+          <w:rFonts w:ascii="Consolas" w:cs="Consolas" w:eastAsia="Consolas" w:hAnsi="Consolas"/>
+          <w:color w:val="103D63"/>
           <w:sz w:val="18"/>
           <w:szCs w:val="18"/>
         </w:rPr>
@@ -2868,15 +2921,16 @@
     <w:p>
       <w:pPr>
         <w:pBdr>
-          <w:left w:val="single" w:color="1F4E79" w:sz="18" w:space="6"/>
-        </w:pBdr>
-        <w:shd w:fill="1E1E1E" w:val="clear"/>
-        <w:spacing w:after="0" w:before="0" w:line="240"/>
-      </w:pPr>
-      <w:r>
-        <w:rPr>
-          <w:rFonts w:ascii="Consolas" w:cs="Consolas" w:eastAsia="Consolas" w:hAnsi="Consolas"/>
-          <w:color w:val="E6EDF3"/>
+          <w:left w:val="single" w:color="2F6FB3" w:sz="24" w:space="10"/>
+          <w:right w:val="single" w:color="C9DDF2" w:sz="6" w:space="3"/>
+        </w:pBdr>
+        <w:shd w:fill="EAF2FB" w:val="clear"/>
+        <w:spacing w:after="0" w:before="0" w:line="252"/>
+      </w:pPr>
+      <w:r>
+        <w:rPr>
+          <w:rFonts w:ascii="Consolas" w:cs="Consolas" w:eastAsia="Consolas" w:hAnsi="Consolas"/>
+          <w:color w:val="103D63"/>
           <w:sz w:val="18"/>
           <w:szCs w:val="18"/>
         </w:rPr>
@@ -2886,15 +2940,16 @@
     <w:p>
       <w:pPr>
         <w:pBdr>
-          <w:left w:val="single" w:color="1F4E79" w:sz="18" w:space="6"/>
-        </w:pBdr>
-        <w:shd w:fill="1E1E1E" w:val="clear"/>
-        <w:spacing w:after="0" w:before="0" w:line="240"/>
-      </w:pPr>
-      <w:r>
-        <w:rPr>
-          <w:rFonts w:ascii="Consolas" w:cs="Consolas" w:eastAsia="Consolas" w:hAnsi="Consolas"/>
-          <w:color w:val="E6EDF3"/>
+          <w:left w:val="single" w:color="2F6FB3" w:sz="24" w:space="10"/>
+          <w:right w:val="single" w:color="C9DDF2" w:sz="6" w:space="3"/>
+        </w:pBdr>
+        <w:shd w:fill="EAF2FB" w:val="clear"/>
+        <w:spacing w:after="0" w:before="0" w:line="252"/>
+      </w:pPr>
+      <w:r>
+        <w:rPr>
+          <w:rFonts w:ascii="Consolas" w:cs="Consolas" w:eastAsia="Consolas" w:hAnsi="Consolas"/>
+          <w:color w:val="103D63"/>
           <w:sz w:val="18"/>
           <w:szCs w:val="18"/>
         </w:rPr>
@@ -2904,15 +2959,17 @@
     <w:p>
       <w:pPr>
         <w:pBdr>
-          <w:left w:val="single" w:color="1F4E79" w:sz="18" w:space="6"/>
-        </w:pBdr>
-        <w:shd w:fill="1E1E1E" w:val="clear"/>
-        <w:spacing w:after="120" w:before="0" w:line="240"/>
-      </w:pPr>
-      <w:r>
-        <w:rPr>
-          <w:rFonts w:ascii="Consolas" w:cs="Consolas" w:eastAsia="Consolas" w:hAnsi="Consolas"/>
-          <w:color w:val="E6EDF3"/>
+          <w:left w:val="single" w:color="2F6FB3" w:sz="24" w:space="10"/>
+          <w:bottom w:val="single" w:color="C9DDF2" w:sz="6" w:space="3"/>
+          <w:right w:val="single" w:color="C9DDF2" w:sz="6" w:space="3"/>
+        </w:pBdr>
+        <w:shd w:fill="EAF2FB" w:val="clear"/>
+        <w:spacing w:after="150" w:before="0" w:line="252"/>
+      </w:pPr>
+      <w:r>
+        <w:rPr>
+          <w:rFonts w:ascii="Consolas" w:cs="Consolas" w:eastAsia="Consolas" w:hAnsi="Consolas"/>
+          <w:color w:val="103D63"/>
           <w:sz w:val="18"/>
           <w:szCs w:val="18"/>
         </w:rPr>
@@ -2937,15 +2994,17 @@
     <w:p>
       <w:pPr>
         <w:pBdr>
-          <w:left w:val="single" w:color="1F4E79" w:sz="18" w:space="6"/>
-        </w:pBdr>
-        <w:shd w:fill="1E1E1E" w:val="clear"/>
-        <w:spacing w:after="0" w:before="40" w:line="240"/>
-      </w:pPr>
-      <w:r>
-        <w:rPr>
-          <w:rFonts w:ascii="Consolas" w:cs="Consolas" w:eastAsia="Consolas" w:hAnsi="Consolas"/>
-          <w:color w:val="E6EDF3"/>
+          <w:top w:val="single" w:color="C9DDF2" w:sz="6" w:space="3"/>
+          <w:left w:val="single" w:color="2F6FB3" w:sz="24" w:space="10"/>
+          <w:right w:val="single" w:color="C9DDF2" w:sz="6" w:space="3"/>
+        </w:pBdr>
+        <w:shd w:fill="EAF2FB" w:val="clear"/>
+        <w:spacing w:after="0" w:before="60" w:line="252"/>
+      </w:pPr>
+      <w:r>
+        <w:rPr>
+          <w:rFonts w:ascii="Consolas" w:cs="Consolas" w:eastAsia="Consolas" w:hAnsi="Consolas"/>
+          <w:color w:val="103D63"/>
           <w:sz w:val="18"/>
           <w:szCs w:val="18"/>
         </w:rPr>
@@ -2955,15 +3014,16 @@
     <w:p>
       <w:pPr>
         <w:pBdr>
-          <w:left w:val="single" w:color="1F4E79" w:sz="18" w:space="6"/>
-        </w:pBdr>
-        <w:shd w:fill="1E1E1E" w:val="clear"/>
-        <w:spacing w:after="0" w:before="0" w:line="240"/>
-      </w:pPr>
-      <w:r>
-        <w:rPr>
-          <w:rFonts w:ascii="Consolas" w:cs="Consolas" w:eastAsia="Consolas" w:hAnsi="Consolas"/>
-          <w:color w:val="E6EDF3"/>
+          <w:left w:val="single" w:color="2F6FB3" w:sz="24" w:space="10"/>
+          <w:right w:val="single" w:color="C9DDF2" w:sz="6" w:space="3"/>
+        </w:pBdr>
+        <w:shd w:fill="EAF2FB" w:val="clear"/>
+        <w:spacing w:after="0" w:before="0" w:line="252"/>
+      </w:pPr>
+      <w:r>
+        <w:rPr>
+          <w:rFonts w:ascii="Consolas" w:cs="Consolas" w:eastAsia="Consolas" w:hAnsi="Consolas"/>
+          <w:color w:val="103D63"/>
           <w:sz w:val="18"/>
           <w:szCs w:val="18"/>
         </w:rPr>
@@ -2973,15 +3033,16 @@
     <w:p>
       <w:pPr>
         <w:pBdr>
-          <w:left w:val="single" w:color="1F4E79" w:sz="18" w:space="6"/>
-        </w:pBdr>
-        <w:shd w:fill="1E1E1E" w:val="clear"/>
-        <w:spacing w:after="0" w:before="0" w:line="240"/>
-      </w:pPr>
-      <w:r>
-        <w:rPr>
-          <w:rFonts w:ascii="Consolas" w:cs="Consolas" w:eastAsia="Consolas" w:hAnsi="Consolas"/>
-          <w:color w:val="E6EDF3"/>
+          <w:left w:val="single" w:color="2F6FB3" w:sz="24" w:space="10"/>
+          <w:right w:val="single" w:color="C9DDF2" w:sz="6" w:space="3"/>
+        </w:pBdr>
+        <w:shd w:fill="EAF2FB" w:val="clear"/>
+        <w:spacing w:after="0" w:before="0" w:line="252"/>
+      </w:pPr>
+      <w:r>
+        <w:rPr>
+          <w:rFonts w:ascii="Consolas" w:cs="Consolas" w:eastAsia="Consolas" w:hAnsi="Consolas"/>
+          <w:color w:val="103D63"/>
           <w:sz w:val="18"/>
           <w:szCs w:val="18"/>
         </w:rPr>
@@ -2991,15 +3052,16 @@
     <w:p>
       <w:pPr>
         <w:pBdr>
-          <w:left w:val="single" w:color="1F4E79" w:sz="18" w:space="6"/>
-        </w:pBdr>
-        <w:shd w:fill="1E1E1E" w:val="clear"/>
-        <w:spacing w:after="0" w:before="0" w:line="240"/>
-      </w:pPr>
-      <w:r>
-        <w:rPr>
-          <w:rFonts w:ascii="Consolas" w:cs="Consolas" w:eastAsia="Consolas" w:hAnsi="Consolas"/>
-          <w:color w:val="E6EDF3"/>
+          <w:left w:val="single" w:color="2F6FB3" w:sz="24" w:space="10"/>
+          <w:right w:val="single" w:color="C9DDF2" w:sz="6" w:space="3"/>
+        </w:pBdr>
+        <w:shd w:fill="EAF2FB" w:val="clear"/>
+        <w:spacing w:after="0" w:before="0" w:line="252"/>
+      </w:pPr>
+      <w:r>
+        <w:rPr>
+          <w:rFonts w:ascii="Consolas" w:cs="Consolas" w:eastAsia="Consolas" w:hAnsi="Consolas"/>
+          <w:color w:val="103D63"/>
           <w:sz w:val="18"/>
           <w:szCs w:val="18"/>
         </w:rPr>
@@ -3009,15 +3071,16 @@
     <w:p>
       <w:pPr>
         <w:pBdr>
-          <w:left w:val="single" w:color="1F4E79" w:sz="18" w:space="6"/>
-        </w:pBdr>
-        <w:shd w:fill="1E1E1E" w:val="clear"/>
-        <w:spacing w:after="0" w:before="0" w:line="240"/>
-      </w:pPr>
-      <w:r>
-        <w:rPr>
-          <w:rFonts w:ascii="Consolas" w:cs="Consolas" w:eastAsia="Consolas" w:hAnsi="Consolas"/>
-          <w:color w:val="E6EDF3"/>
+          <w:left w:val="single" w:color="2F6FB3" w:sz="24" w:space="10"/>
+          <w:right w:val="single" w:color="C9DDF2" w:sz="6" w:space="3"/>
+        </w:pBdr>
+        <w:shd w:fill="EAF2FB" w:val="clear"/>
+        <w:spacing w:after="0" w:before="0" w:line="252"/>
+      </w:pPr>
+      <w:r>
+        <w:rPr>
+          <w:rFonts w:ascii="Consolas" w:cs="Consolas" w:eastAsia="Consolas" w:hAnsi="Consolas"/>
+          <w:color w:val="103D63"/>
           <w:sz w:val="18"/>
           <w:szCs w:val="18"/>
         </w:rPr>
@@ -3027,15 +3090,16 @@
     <w:p>
       <w:pPr>
         <w:pBdr>
-          <w:left w:val="single" w:color="1F4E79" w:sz="18" w:space="6"/>
-        </w:pBdr>
-        <w:shd w:fill="1E1E1E" w:val="clear"/>
-        <w:spacing w:after="0" w:before="0" w:line="240"/>
-      </w:pPr>
-      <w:r>
-        <w:rPr>
-          <w:rFonts w:ascii="Consolas" w:cs="Consolas" w:eastAsia="Consolas" w:hAnsi="Consolas"/>
-          <w:color w:val="E6EDF3"/>
+          <w:left w:val="single" w:color="2F6FB3" w:sz="24" w:space="10"/>
+          <w:right w:val="single" w:color="C9DDF2" w:sz="6" w:space="3"/>
+        </w:pBdr>
+        <w:shd w:fill="EAF2FB" w:val="clear"/>
+        <w:spacing w:after="0" w:before="0" w:line="252"/>
+      </w:pPr>
+      <w:r>
+        <w:rPr>
+          <w:rFonts w:ascii="Consolas" w:cs="Consolas" w:eastAsia="Consolas" w:hAnsi="Consolas"/>
+          <w:color w:val="103D63"/>
           <w:sz w:val="18"/>
           <w:szCs w:val="18"/>
         </w:rPr>
@@ -3045,15 +3109,16 @@
     <w:p>
       <w:pPr>
         <w:pBdr>
-          <w:left w:val="single" w:color="1F4E79" w:sz="18" w:space="6"/>
-        </w:pBdr>
-        <w:shd w:fill="1E1E1E" w:val="clear"/>
-        <w:spacing w:after="0" w:before="0" w:line="240"/>
-      </w:pPr>
-      <w:r>
-        <w:rPr>
-          <w:rFonts w:ascii="Consolas" w:cs="Consolas" w:eastAsia="Consolas" w:hAnsi="Consolas"/>
-          <w:color w:val="E6EDF3"/>
+          <w:left w:val="single" w:color="2F6FB3" w:sz="24" w:space="10"/>
+          <w:right w:val="single" w:color="C9DDF2" w:sz="6" w:space="3"/>
+        </w:pBdr>
+        <w:shd w:fill="EAF2FB" w:val="clear"/>
+        <w:spacing w:after="0" w:before="0" w:line="252"/>
+      </w:pPr>
+      <w:r>
+        <w:rPr>
+          <w:rFonts w:ascii="Consolas" w:cs="Consolas" w:eastAsia="Consolas" w:hAnsi="Consolas"/>
+          <w:color w:val="103D63"/>
           <w:sz w:val="18"/>
           <w:szCs w:val="18"/>
         </w:rPr>
@@ -3063,15 +3128,16 @@
     <w:p>
       <w:pPr>
         <w:pBdr>
-          <w:left w:val="single" w:color="1F4E79" w:sz="18" w:space="6"/>
-        </w:pBdr>
-        <w:shd w:fill="1E1E1E" w:val="clear"/>
-        <w:spacing w:after="0" w:before="0" w:line="240"/>
-      </w:pPr>
-      <w:r>
-        <w:rPr>
-          <w:rFonts w:ascii="Consolas" w:cs="Consolas" w:eastAsia="Consolas" w:hAnsi="Consolas"/>
-          <w:color w:val="E6EDF3"/>
+          <w:left w:val="single" w:color="2F6FB3" w:sz="24" w:space="10"/>
+          <w:right w:val="single" w:color="C9DDF2" w:sz="6" w:space="3"/>
+        </w:pBdr>
+        <w:shd w:fill="EAF2FB" w:val="clear"/>
+        <w:spacing w:after="0" w:before="0" w:line="252"/>
+      </w:pPr>
+      <w:r>
+        <w:rPr>
+          <w:rFonts w:ascii="Consolas" w:cs="Consolas" w:eastAsia="Consolas" w:hAnsi="Consolas"/>
+          <w:color w:val="103D63"/>
           <w:sz w:val="18"/>
           <w:szCs w:val="18"/>
         </w:rPr>
@@ -3081,15 +3147,16 @@
     <w:p>
       <w:pPr>
         <w:pBdr>
-          <w:left w:val="single" w:color="1F4E79" w:sz="18" w:space="6"/>
-        </w:pBdr>
-        <w:shd w:fill="1E1E1E" w:val="clear"/>
-        <w:spacing w:after="0" w:before="0" w:line="240"/>
-      </w:pPr>
-      <w:r>
-        <w:rPr>
-          <w:rFonts w:ascii="Consolas" w:cs="Consolas" w:eastAsia="Consolas" w:hAnsi="Consolas"/>
-          <w:color w:val="E6EDF3"/>
+          <w:left w:val="single" w:color="2F6FB3" w:sz="24" w:space="10"/>
+          <w:right w:val="single" w:color="C9DDF2" w:sz="6" w:space="3"/>
+        </w:pBdr>
+        <w:shd w:fill="EAF2FB" w:val="clear"/>
+        <w:spacing w:after="0" w:before="0" w:line="252"/>
+      </w:pPr>
+      <w:r>
+        <w:rPr>
+          <w:rFonts w:ascii="Consolas" w:cs="Consolas" w:eastAsia="Consolas" w:hAnsi="Consolas"/>
+          <w:color w:val="103D63"/>
           <w:sz w:val="18"/>
           <w:szCs w:val="18"/>
         </w:rPr>
@@ -3099,15 +3166,16 @@
     <w:p>
       <w:pPr>
         <w:pBdr>
-          <w:left w:val="single" w:color="1F4E79" w:sz="18" w:space="6"/>
-        </w:pBdr>
-        <w:shd w:fill="1E1E1E" w:val="clear"/>
-        <w:spacing w:after="0" w:before="0" w:line="240"/>
-      </w:pPr>
-      <w:r>
-        <w:rPr>
-          <w:rFonts w:ascii="Consolas" w:cs="Consolas" w:eastAsia="Consolas" w:hAnsi="Consolas"/>
-          <w:color w:val="E6EDF3"/>
+          <w:left w:val="single" w:color="2F6FB3" w:sz="24" w:space="10"/>
+          <w:right w:val="single" w:color="C9DDF2" w:sz="6" w:space="3"/>
+        </w:pBdr>
+        <w:shd w:fill="EAF2FB" w:val="clear"/>
+        <w:spacing w:after="0" w:before="0" w:line="252"/>
+      </w:pPr>
+      <w:r>
+        <w:rPr>
+          <w:rFonts w:ascii="Consolas" w:cs="Consolas" w:eastAsia="Consolas" w:hAnsi="Consolas"/>
+          <w:color w:val="103D63"/>
           <w:sz w:val="18"/>
           <w:szCs w:val="18"/>
         </w:rPr>
@@ -3117,15 +3185,16 @@
     <w:p>
       <w:pPr>
         <w:pBdr>
-          <w:left w:val="single" w:color="1F4E79" w:sz="18" w:space="6"/>
-        </w:pBdr>
-        <w:shd w:fill="1E1E1E" w:val="clear"/>
-        <w:spacing w:after="0" w:before="0" w:line="240"/>
-      </w:pPr>
-      <w:r>
-        <w:rPr>
-          <w:rFonts w:ascii="Consolas" w:cs="Consolas" w:eastAsia="Consolas" w:hAnsi="Consolas"/>
-          <w:color w:val="E6EDF3"/>
+          <w:left w:val="single" w:color="2F6FB3" w:sz="24" w:space="10"/>
+          <w:right w:val="single" w:color="C9DDF2" w:sz="6" w:space="3"/>
+        </w:pBdr>
+        <w:shd w:fill="EAF2FB" w:val="clear"/>
+        <w:spacing w:after="0" w:before="0" w:line="252"/>
+      </w:pPr>
+      <w:r>
+        <w:rPr>
+          <w:rFonts w:ascii="Consolas" w:cs="Consolas" w:eastAsia="Consolas" w:hAnsi="Consolas"/>
+          <w:color w:val="103D63"/>
           <w:sz w:val="18"/>
           <w:szCs w:val="18"/>
         </w:rPr>
@@ -3135,15 +3204,16 @@
     <w:p>
       <w:pPr>
         <w:pBdr>
-          <w:left w:val="single" w:color="1F4E79" w:sz="18" w:space="6"/>
-        </w:pBdr>
-        <w:shd w:fill="1E1E1E" w:val="clear"/>
-        <w:spacing w:after="0" w:before="0" w:line="240"/>
-      </w:pPr>
-      <w:r>
-        <w:rPr>
-          <w:rFonts w:ascii="Consolas" w:cs="Consolas" w:eastAsia="Consolas" w:hAnsi="Consolas"/>
-          <w:color w:val="E6EDF3"/>
+          <w:left w:val="single" w:color="2F6FB3" w:sz="24" w:space="10"/>
+          <w:right w:val="single" w:color="C9DDF2" w:sz="6" w:space="3"/>
+        </w:pBdr>
+        <w:shd w:fill="EAF2FB" w:val="clear"/>
+        <w:spacing w:after="0" w:before="0" w:line="252"/>
+      </w:pPr>
+      <w:r>
+        <w:rPr>
+          <w:rFonts w:ascii="Consolas" w:cs="Consolas" w:eastAsia="Consolas" w:hAnsi="Consolas"/>
+          <w:color w:val="103D63"/>
           <w:sz w:val="18"/>
           <w:szCs w:val="18"/>
         </w:rPr>
@@ -3153,15 +3223,16 @@
     <w:p>
       <w:pPr>
         <w:pBdr>
-          <w:left w:val="single" w:color="1F4E79" w:sz="18" w:space="6"/>
-        </w:pBdr>
-        <w:shd w:fill="1E1E1E" w:val="clear"/>
-        <w:spacing w:after="0" w:before="0" w:line="240"/>
-      </w:pPr>
-      <w:r>
-        <w:rPr>
-          <w:rFonts w:ascii="Consolas" w:cs="Consolas" w:eastAsia="Consolas" w:hAnsi="Consolas"/>
-          <w:color w:val="E6EDF3"/>
+          <w:left w:val="single" w:color="2F6FB3" w:sz="24" w:space="10"/>
+          <w:right w:val="single" w:color="C9DDF2" w:sz="6" w:space="3"/>
+        </w:pBdr>
+        <w:shd w:fill="EAF2FB" w:val="clear"/>
+        <w:spacing w:after="0" w:before="0" w:line="252"/>
+      </w:pPr>
+      <w:r>
+        <w:rPr>
+          <w:rFonts w:ascii="Consolas" w:cs="Consolas" w:eastAsia="Consolas" w:hAnsi="Consolas"/>
+          <w:color w:val="103D63"/>
           <w:sz w:val="18"/>
           <w:szCs w:val="18"/>
         </w:rPr>
@@ -3171,15 +3242,16 @@
     <w:p>
       <w:pPr>
         <w:pBdr>
-          <w:left w:val="single" w:color="1F4E79" w:sz="18" w:space="6"/>
-        </w:pBdr>
-        <w:shd w:fill="1E1E1E" w:val="clear"/>
-        <w:spacing w:after="0" w:before="0" w:line="240"/>
-      </w:pPr>
-      <w:r>
-        <w:rPr>
-          <w:rFonts w:ascii="Consolas" w:cs="Consolas" w:eastAsia="Consolas" w:hAnsi="Consolas"/>
-          <w:color w:val="E6EDF3"/>
+          <w:left w:val="single" w:color="2F6FB3" w:sz="24" w:space="10"/>
+          <w:right w:val="single" w:color="C9DDF2" w:sz="6" w:space="3"/>
+        </w:pBdr>
+        <w:shd w:fill="EAF2FB" w:val="clear"/>
+        <w:spacing w:after="0" w:before="0" w:line="252"/>
+      </w:pPr>
+      <w:r>
+        <w:rPr>
+          <w:rFonts w:ascii="Consolas" w:cs="Consolas" w:eastAsia="Consolas" w:hAnsi="Consolas"/>
+          <w:color w:val="103D63"/>
           <w:sz w:val="18"/>
           <w:szCs w:val="18"/>
         </w:rPr>
@@ -3189,15 +3261,16 @@
     <w:p>
       <w:pPr>
         <w:pBdr>
-          <w:left w:val="single" w:color="1F4E79" w:sz="18" w:space="6"/>
-        </w:pBdr>
-        <w:shd w:fill="1E1E1E" w:val="clear"/>
-        <w:spacing w:after="0" w:before="0" w:line="240"/>
-      </w:pPr>
-      <w:r>
-        <w:rPr>
-          <w:rFonts w:ascii="Consolas" w:cs="Consolas" w:eastAsia="Consolas" w:hAnsi="Consolas"/>
-          <w:color w:val="E6EDF3"/>
+          <w:left w:val="single" w:color="2F6FB3" w:sz="24" w:space="10"/>
+          <w:right w:val="single" w:color="C9DDF2" w:sz="6" w:space="3"/>
+        </w:pBdr>
+        <w:shd w:fill="EAF2FB" w:val="clear"/>
+        <w:spacing w:after="0" w:before="0" w:line="252"/>
+      </w:pPr>
+      <w:r>
+        <w:rPr>
+          <w:rFonts w:ascii="Consolas" w:cs="Consolas" w:eastAsia="Consolas" w:hAnsi="Consolas"/>
+          <w:color w:val="103D63"/>
           <w:sz w:val="18"/>
           <w:szCs w:val="18"/>
         </w:rPr>
@@ -3207,15 +3280,16 @@
     <w:p>
       <w:pPr>
         <w:pBdr>
-          <w:left w:val="single" w:color="1F4E79" w:sz="18" w:space="6"/>
-        </w:pBdr>
-        <w:shd w:fill="1E1E1E" w:val="clear"/>
-        <w:spacing w:after="0" w:before="0" w:line="240"/>
-      </w:pPr>
-      <w:r>
-        <w:rPr>
-          <w:rFonts w:ascii="Consolas" w:cs="Consolas" w:eastAsia="Consolas" w:hAnsi="Consolas"/>
-          <w:color w:val="E6EDF3"/>
+          <w:left w:val="single" w:color="2F6FB3" w:sz="24" w:space="10"/>
+          <w:right w:val="single" w:color="C9DDF2" w:sz="6" w:space="3"/>
+        </w:pBdr>
+        <w:shd w:fill="EAF2FB" w:val="clear"/>
+        <w:spacing w:after="0" w:before="0" w:line="252"/>
+      </w:pPr>
+      <w:r>
+        <w:rPr>
+          <w:rFonts w:ascii="Consolas" w:cs="Consolas" w:eastAsia="Consolas" w:hAnsi="Consolas"/>
+          <w:color w:val="103D63"/>
           <w:sz w:val="18"/>
           <w:szCs w:val="18"/>
         </w:rPr>
@@ -3225,15 +3299,16 @@
     <w:p>
       <w:pPr>
         <w:pBdr>
-          <w:left w:val="single" w:color="1F4E79" w:sz="18" w:space="6"/>
-        </w:pBdr>
-        <w:shd w:fill="1E1E1E" w:val="clear"/>
-        <w:spacing w:after="0" w:before="0" w:line="240"/>
-      </w:pPr>
-      <w:r>
-        <w:rPr>
-          <w:rFonts w:ascii="Consolas" w:cs="Consolas" w:eastAsia="Consolas" w:hAnsi="Consolas"/>
-          <w:color w:val="E6EDF3"/>
+          <w:left w:val="single" w:color="2F6FB3" w:sz="24" w:space="10"/>
+          <w:right w:val="single" w:color="C9DDF2" w:sz="6" w:space="3"/>
+        </w:pBdr>
+        <w:shd w:fill="EAF2FB" w:val="clear"/>
+        <w:spacing w:after="0" w:before="0" w:line="252"/>
+      </w:pPr>
+      <w:r>
+        <w:rPr>
+          <w:rFonts w:ascii="Consolas" w:cs="Consolas" w:eastAsia="Consolas" w:hAnsi="Consolas"/>
+          <w:color w:val="103D63"/>
           <w:sz w:val="18"/>
           <w:szCs w:val="18"/>
         </w:rPr>
@@ -3243,15 +3318,16 @@
     <w:p>
       <w:pPr>
         <w:pBdr>
-          <w:left w:val="single" w:color="1F4E79" w:sz="18" w:space="6"/>
-        </w:pBdr>
-        <w:shd w:fill="1E1E1E" w:val="clear"/>
-        <w:spacing w:after="0" w:before="0" w:line="240"/>
-      </w:pPr>
-      <w:r>
-        <w:rPr>
-          <w:rFonts w:ascii="Consolas" w:cs="Consolas" w:eastAsia="Consolas" w:hAnsi="Consolas"/>
-          <w:color w:val="E6EDF3"/>
+          <w:left w:val="single" w:color="2F6FB3" w:sz="24" w:space="10"/>
+          <w:right w:val="single" w:color="C9DDF2" w:sz="6" w:space="3"/>
+        </w:pBdr>
+        <w:shd w:fill="EAF2FB" w:val="clear"/>
+        <w:spacing w:after="0" w:before="0" w:line="252"/>
+      </w:pPr>
+      <w:r>
+        <w:rPr>
+          <w:rFonts w:ascii="Consolas" w:cs="Consolas" w:eastAsia="Consolas" w:hAnsi="Consolas"/>
+          <w:color w:val="103D63"/>
           <w:sz w:val="18"/>
           <w:szCs w:val="18"/>
         </w:rPr>
@@ -3261,15 +3337,16 @@
     <w:p>
       <w:pPr>
         <w:pBdr>
-          <w:left w:val="single" w:color="1F4E79" w:sz="18" w:space="6"/>
-        </w:pBdr>
-        <w:shd w:fill="1E1E1E" w:val="clear"/>
-        <w:spacing w:after="0" w:before="0" w:line="240"/>
-      </w:pPr>
-      <w:r>
-        <w:rPr>
-          <w:rFonts w:ascii="Consolas" w:cs="Consolas" w:eastAsia="Consolas" w:hAnsi="Consolas"/>
-          <w:color w:val="E6EDF3"/>
+          <w:left w:val="single" w:color="2F6FB3" w:sz="24" w:space="10"/>
+          <w:right w:val="single" w:color="C9DDF2" w:sz="6" w:space="3"/>
+        </w:pBdr>
+        <w:shd w:fill="EAF2FB" w:val="clear"/>
+        <w:spacing w:after="0" w:before="0" w:line="252"/>
+      </w:pPr>
+      <w:r>
+        <w:rPr>
+          <w:rFonts w:ascii="Consolas" w:cs="Consolas" w:eastAsia="Consolas" w:hAnsi="Consolas"/>
+          <w:color w:val="103D63"/>
           <w:sz w:val="18"/>
           <w:szCs w:val="18"/>
         </w:rPr>
@@ -3279,15 +3356,16 @@
     <w:p>
       <w:pPr>
         <w:pBdr>
-          <w:left w:val="single" w:color="1F4E79" w:sz="18" w:space="6"/>
-        </w:pBdr>
-        <w:shd w:fill="1E1E1E" w:val="clear"/>
-        <w:spacing w:after="0" w:before="0" w:line="240"/>
-      </w:pPr>
-      <w:r>
-        <w:rPr>
-          <w:rFonts w:ascii="Consolas" w:cs="Consolas" w:eastAsia="Consolas" w:hAnsi="Consolas"/>
-          <w:color w:val="E6EDF3"/>
+          <w:left w:val="single" w:color="2F6FB3" w:sz="24" w:space="10"/>
+          <w:right w:val="single" w:color="C9DDF2" w:sz="6" w:space="3"/>
+        </w:pBdr>
+        <w:shd w:fill="EAF2FB" w:val="clear"/>
+        <w:spacing w:after="0" w:before="0" w:line="252"/>
+      </w:pPr>
+      <w:r>
+        <w:rPr>
+          <w:rFonts w:ascii="Consolas" w:cs="Consolas" w:eastAsia="Consolas" w:hAnsi="Consolas"/>
+          <w:color w:val="103D63"/>
           <w:sz w:val="18"/>
           <w:szCs w:val="18"/>
         </w:rPr>
@@ -3297,15 +3375,16 @@
     <w:p>
       <w:pPr>
         <w:pBdr>
-          <w:left w:val="single" w:color="1F4E79" w:sz="18" w:space="6"/>
-        </w:pBdr>
-        <w:shd w:fill="1E1E1E" w:val="clear"/>
-        <w:spacing w:after="0" w:before="0" w:line="240"/>
-      </w:pPr>
-      <w:r>
-        <w:rPr>
-          <w:rFonts w:ascii="Consolas" w:cs="Consolas" w:eastAsia="Consolas" w:hAnsi="Consolas"/>
-          <w:color w:val="E6EDF3"/>
+          <w:left w:val="single" w:color="2F6FB3" w:sz="24" w:space="10"/>
+          <w:right w:val="single" w:color="C9DDF2" w:sz="6" w:space="3"/>
+        </w:pBdr>
+        <w:shd w:fill="EAF2FB" w:val="clear"/>
+        <w:spacing w:after="0" w:before="0" w:line="252"/>
+      </w:pPr>
+      <w:r>
+        <w:rPr>
+          <w:rFonts w:ascii="Consolas" w:cs="Consolas" w:eastAsia="Consolas" w:hAnsi="Consolas"/>
+          <w:color w:val="103D63"/>
           <w:sz w:val="18"/>
           <w:szCs w:val="18"/>
         </w:rPr>
@@ -3315,15 +3394,16 @@
     <w:p>
       <w:pPr>
         <w:pBdr>
-          <w:left w:val="single" w:color="1F4E79" w:sz="18" w:space="6"/>
-        </w:pBdr>
-        <w:shd w:fill="1E1E1E" w:val="clear"/>
-        <w:spacing w:after="0" w:before="0" w:line="240"/>
-      </w:pPr>
-      <w:r>
-        <w:rPr>
-          <w:rFonts w:ascii="Consolas" w:cs="Consolas" w:eastAsia="Consolas" w:hAnsi="Consolas"/>
-          <w:color w:val="E6EDF3"/>
+          <w:left w:val="single" w:color="2F6FB3" w:sz="24" w:space="10"/>
+          <w:right w:val="single" w:color="C9DDF2" w:sz="6" w:space="3"/>
+        </w:pBdr>
+        <w:shd w:fill="EAF2FB" w:val="clear"/>
+        <w:spacing w:after="0" w:before="0" w:line="252"/>
+      </w:pPr>
+      <w:r>
+        <w:rPr>
+          <w:rFonts w:ascii="Consolas" w:cs="Consolas" w:eastAsia="Consolas" w:hAnsi="Consolas"/>
+          <w:color w:val="103D63"/>
           <w:sz w:val="18"/>
           <w:szCs w:val="18"/>
         </w:rPr>
@@ -3333,15 +3413,16 @@
     <w:p>
       <w:pPr>
         <w:pBdr>
-          <w:left w:val="single" w:color="1F4E79" w:sz="18" w:space="6"/>
-        </w:pBdr>
-        <w:shd w:fill="1E1E1E" w:val="clear"/>
-        <w:spacing w:after="0" w:before="0" w:line="240"/>
-      </w:pPr>
-      <w:r>
-        <w:rPr>
-          <w:rFonts w:ascii="Consolas" w:cs="Consolas" w:eastAsia="Consolas" w:hAnsi="Consolas"/>
-          <w:color w:val="E6EDF3"/>
+          <w:left w:val="single" w:color="2F6FB3" w:sz="24" w:space="10"/>
+          <w:right w:val="single" w:color="C9DDF2" w:sz="6" w:space="3"/>
+        </w:pBdr>
+        <w:shd w:fill="EAF2FB" w:val="clear"/>
+        <w:spacing w:after="0" w:before="0" w:line="252"/>
+      </w:pPr>
+      <w:r>
+        <w:rPr>
+          <w:rFonts w:ascii="Consolas" w:cs="Consolas" w:eastAsia="Consolas" w:hAnsi="Consolas"/>
+          <w:color w:val="103D63"/>
           <w:sz w:val="18"/>
           <w:szCs w:val="18"/>
         </w:rPr>
@@ -3351,15 +3432,16 @@
     <w:p>
       <w:pPr>
         <w:pBdr>
-          <w:left w:val="single" w:color="1F4E79" w:sz="18" w:space="6"/>
-        </w:pBdr>
-        <w:shd w:fill="1E1E1E" w:val="clear"/>
-        <w:spacing w:after="0" w:before="0" w:line="240"/>
-      </w:pPr>
-      <w:r>
-        <w:rPr>
-          <w:rFonts w:ascii="Consolas" w:cs="Consolas" w:eastAsia="Consolas" w:hAnsi="Consolas"/>
-          <w:color w:val="E6EDF3"/>
+          <w:left w:val="single" w:color="2F6FB3" w:sz="24" w:space="10"/>
+          <w:right w:val="single" w:color="C9DDF2" w:sz="6" w:space="3"/>
+        </w:pBdr>
+        <w:shd w:fill="EAF2FB" w:val="clear"/>
+        <w:spacing w:after="0" w:before="0" w:line="252"/>
+      </w:pPr>
+      <w:r>
+        <w:rPr>
+          <w:rFonts w:ascii="Consolas" w:cs="Consolas" w:eastAsia="Consolas" w:hAnsi="Consolas"/>
+          <w:color w:val="103D63"/>
           <w:sz w:val="18"/>
           <w:szCs w:val="18"/>
         </w:rPr>
@@ -3369,15 +3451,17 @@
     <w:p>
       <w:pPr>
         <w:pBdr>
-          <w:left w:val="single" w:color="1F4E79" w:sz="18" w:space="6"/>
-        </w:pBdr>
-        <w:shd w:fill="1E1E1E" w:val="clear"/>
-        <w:spacing w:after="120" w:before="0" w:line="240"/>
-      </w:pPr>
-      <w:r>
-        <w:rPr>
-          <w:rFonts w:ascii="Consolas" w:cs="Consolas" w:eastAsia="Consolas" w:hAnsi="Consolas"/>
-          <w:color w:val="E6EDF3"/>
+          <w:left w:val="single" w:color="2F6FB3" w:sz="24" w:space="10"/>
+          <w:bottom w:val="single" w:color="C9DDF2" w:sz="6" w:space="3"/>
+          <w:right w:val="single" w:color="C9DDF2" w:sz="6" w:space="3"/>
+        </w:pBdr>
+        <w:shd w:fill="EAF2FB" w:val="clear"/>
+        <w:spacing w:after="150" w:before="0" w:line="252"/>
+      </w:pPr>
+      <w:r>
+        <w:rPr>
+          <w:rFonts w:ascii="Consolas" w:cs="Consolas" w:eastAsia="Consolas" w:hAnsi="Consolas"/>
+          <w:color w:val="103D63"/>
           <w:sz w:val="18"/>
           <w:szCs w:val="18"/>
         </w:rPr>
@@ -3410,15 +3494,17 @@
     <w:p>
       <w:pPr>
         <w:pBdr>
-          <w:left w:val="single" w:color="1F4E79" w:sz="18" w:space="6"/>
-        </w:pBdr>
-        <w:shd w:fill="1E1E1E" w:val="clear"/>
-        <w:spacing w:after="0" w:before="40" w:line="240"/>
-      </w:pPr>
-      <w:r>
-        <w:rPr>
-          <w:rFonts w:ascii="Consolas" w:cs="Consolas" w:eastAsia="Consolas" w:hAnsi="Consolas"/>
-          <w:color w:val="E6EDF3"/>
+          <w:top w:val="single" w:color="C9DDF2" w:sz="6" w:space="3"/>
+          <w:left w:val="single" w:color="2F6FB3" w:sz="24" w:space="10"/>
+          <w:right w:val="single" w:color="C9DDF2" w:sz="6" w:space="3"/>
+        </w:pBdr>
+        <w:shd w:fill="EAF2FB" w:val="clear"/>
+        <w:spacing w:after="0" w:before="60" w:line="252"/>
+      </w:pPr>
+      <w:r>
+        <w:rPr>
+          <w:rFonts w:ascii="Consolas" w:cs="Consolas" w:eastAsia="Consolas" w:hAnsi="Consolas"/>
+          <w:color w:val="103D63"/>
           <w:sz w:val="18"/>
           <w:szCs w:val="18"/>
         </w:rPr>
@@ -3428,15 +3514,16 @@
     <w:p>
       <w:pPr>
         <w:pBdr>
-          <w:left w:val="single" w:color="1F4E79" w:sz="18" w:space="6"/>
-        </w:pBdr>
-        <w:shd w:fill="1E1E1E" w:val="clear"/>
-        <w:spacing w:after="0" w:before="0" w:line="240"/>
-      </w:pPr>
-      <w:r>
-        <w:rPr>
-          <w:rFonts w:ascii="Consolas" w:cs="Consolas" w:eastAsia="Consolas" w:hAnsi="Consolas"/>
-          <w:color w:val="E6EDF3"/>
+          <w:left w:val="single" w:color="2F6FB3" w:sz="24" w:space="10"/>
+          <w:right w:val="single" w:color="C9DDF2" w:sz="6" w:space="3"/>
+        </w:pBdr>
+        <w:shd w:fill="EAF2FB" w:val="clear"/>
+        <w:spacing w:after="0" w:before="0" w:line="252"/>
+      </w:pPr>
+      <w:r>
+        <w:rPr>
+          <w:rFonts w:ascii="Consolas" w:cs="Consolas" w:eastAsia="Consolas" w:hAnsi="Consolas"/>
+          <w:color w:val="103D63"/>
           <w:sz w:val="18"/>
           <w:szCs w:val="18"/>
         </w:rPr>
@@ -3446,15 +3533,16 @@
     <w:p>
       <w:pPr>
         <w:pBdr>
-          <w:left w:val="single" w:color="1F4E79" w:sz="18" w:space="6"/>
-        </w:pBdr>
-        <w:shd w:fill="1E1E1E" w:val="clear"/>
-        <w:spacing w:after="0" w:before="0" w:line="240"/>
-      </w:pPr>
-      <w:r>
-        <w:rPr>
-          <w:rFonts w:ascii="Consolas" w:cs="Consolas" w:eastAsia="Consolas" w:hAnsi="Consolas"/>
-          <w:color w:val="E6EDF3"/>
+          <w:left w:val="single" w:color="2F6FB3" w:sz="24" w:space="10"/>
+          <w:right w:val="single" w:color="C9DDF2" w:sz="6" w:space="3"/>
+        </w:pBdr>
+        <w:shd w:fill="EAF2FB" w:val="clear"/>
+        <w:spacing w:after="0" w:before="0" w:line="252"/>
+      </w:pPr>
+      <w:r>
+        <w:rPr>
+          <w:rFonts w:ascii="Consolas" w:cs="Consolas" w:eastAsia="Consolas" w:hAnsi="Consolas"/>
+          <w:color w:val="103D63"/>
           <w:sz w:val="18"/>
           <w:szCs w:val="18"/>
         </w:rPr>
@@ -3464,15 +3552,16 @@
     <w:p>
       <w:pPr>
         <w:pBdr>
-          <w:left w:val="single" w:color="1F4E79" w:sz="18" w:space="6"/>
-        </w:pBdr>
-        <w:shd w:fill="1E1E1E" w:val="clear"/>
-        <w:spacing w:after="0" w:before="0" w:line="240"/>
-      </w:pPr>
-      <w:r>
-        <w:rPr>
-          <w:rFonts w:ascii="Consolas" w:cs="Consolas" w:eastAsia="Consolas" w:hAnsi="Consolas"/>
-          <w:color w:val="E6EDF3"/>
+          <w:left w:val="single" w:color="2F6FB3" w:sz="24" w:space="10"/>
+          <w:right w:val="single" w:color="C9DDF2" w:sz="6" w:space="3"/>
+        </w:pBdr>
+        <w:shd w:fill="EAF2FB" w:val="clear"/>
+        <w:spacing w:after="0" w:before="0" w:line="252"/>
+      </w:pPr>
+      <w:r>
+        <w:rPr>
+          <w:rFonts w:ascii="Consolas" w:cs="Consolas" w:eastAsia="Consolas" w:hAnsi="Consolas"/>
+          <w:color w:val="103D63"/>
           <w:sz w:val="18"/>
           <w:szCs w:val="18"/>
         </w:rPr>
@@ -3482,15 +3571,17 @@
     <w:p>
       <w:pPr>
         <w:pBdr>
-          <w:left w:val="single" w:color="1F4E79" w:sz="18" w:space="6"/>
-        </w:pBdr>
-        <w:shd w:fill="1E1E1E" w:val="clear"/>
-        <w:spacing w:after="120" w:before="0" w:line="240"/>
-      </w:pPr>
-      <w:r>
-        <w:rPr>
-          <w:rFonts w:ascii="Consolas" w:cs="Consolas" w:eastAsia="Consolas" w:hAnsi="Consolas"/>
-          <w:color w:val="E6EDF3"/>
+          <w:left w:val="single" w:color="2F6FB3" w:sz="24" w:space="10"/>
+          <w:bottom w:val="single" w:color="C9DDF2" w:sz="6" w:space="3"/>
+          <w:right w:val="single" w:color="C9DDF2" w:sz="6" w:space="3"/>
+        </w:pBdr>
+        <w:shd w:fill="EAF2FB" w:val="clear"/>
+        <w:spacing w:after="150" w:before="0" w:line="252"/>
+      </w:pPr>
+      <w:r>
+        <w:rPr>
+          <w:rFonts w:ascii="Consolas" w:cs="Consolas" w:eastAsia="Consolas" w:hAnsi="Consolas"/>
+          <w:color w:val="103D63"/>
           <w:sz w:val="18"/>
           <w:szCs w:val="18"/>
         </w:rPr>
@@ -3508,15 +3599,18 @@
     <w:p>
       <w:pPr>
         <w:pBdr>
-          <w:left w:val="single" w:color="1F4E79" w:sz="18" w:space="6"/>
-        </w:pBdr>
-        <w:shd w:fill="1E1E1E" w:val="clear"/>
-        <w:spacing w:after="120" w:before="40" w:line="240"/>
-      </w:pPr>
-      <w:r>
-        <w:rPr>
-          <w:rFonts w:ascii="Consolas" w:cs="Consolas" w:eastAsia="Consolas" w:hAnsi="Consolas"/>
-          <w:color w:val="E6EDF3"/>
+          <w:top w:val="single" w:color="C9DDF2" w:sz="6" w:space="3"/>
+          <w:left w:val="single" w:color="2F6FB3" w:sz="24" w:space="10"/>
+          <w:bottom w:val="single" w:color="C9DDF2" w:sz="6" w:space="3"/>
+          <w:right w:val="single" w:color="C9DDF2" w:sz="6" w:space="3"/>
+        </w:pBdr>
+        <w:shd w:fill="EAF2FB" w:val="clear"/>
+        <w:spacing w:after="150" w:before="60" w:line="252"/>
+      </w:pPr>
+      <w:r>
+        <w:rPr>
+          <w:rFonts w:ascii="Consolas" w:cs="Consolas" w:eastAsia="Consolas" w:hAnsi="Consolas"/>
+          <w:color w:val="103D63"/>
           <w:sz w:val="18"/>
           <w:szCs w:val="18"/>
         </w:rPr>
@@ -3624,15 +3718,18 @@
     <w:p>
       <w:pPr>
         <w:pBdr>
-          <w:left w:val="single" w:color="1F4E79" w:sz="18" w:space="6"/>
-        </w:pBdr>
-        <w:shd w:fill="1E1E1E" w:val="clear"/>
-        <w:spacing w:after="120" w:before="40" w:line="240"/>
-      </w:pPr>
-      <w:r>
-        <w:rPr>
-          <w:rFonts w:ascii="Consolas" w:cs="Consolas" w:eastAsia="Consolas" w:hAnsi="Consolas"/>
-          <w:color w:val="E6EDF3"/>
+          <w:top w:val="single" w:color="C9DDF2" w:sz="6" w:space="3"/>
+          <w:left w:val="single" w:color="2F6FB3" w:sz="24" w:space="10"/>
+          <w:bottom w:val="single" w:color="C9DDF2" w:sz="6" w:space="3"/>
+          <w:right w:val="single" w:color="C9DDF2" w:sz="6" w:space="3"/>
+        </w:pBdr>
+        <w:shd w:fill="EAF2FB" w:val="clear"/>
+        <w:spacing w:after="150" w:before="60" w:line="252"/>
+      </w:pPr>
+      <w:r>
+        <w:rPr>
+          <w:rFonts w:ascii="Consolas" w:cs="Consolas" w:eastAsia="Consolas" w:hAnsi="Consolas"/>
+          <w:color w:val="103D63"/>
           <w:sz w:val="18"/>
           <w:szCs w:val="18"/>
         </w:rPr>
@@ -4428,15 +4525,18 @@
     <w:p>
       <w:pPr>
         <w:pBdr>
-          <w:left w:val="single" w:color="1F4E79" w:sz="18" w:space="6"/>
-        </w:pBdr>
-        <w:shd w:fill="1E1E1E" w:val="clear"/>
-        <w:spacing w:after="120" w:before="40" w:line="240"/>
-      </w:pPr>
-      <w:r>
-        <w:rPr>
-          <w:rFonts w:ascii="Consolas" w:cs="Consolas" w:eastAsia="Consolas" w:hAnsi="Consolas"/>
-          <w:color w:val="E6EDF3"/>
+          <w:top w:val="single" w:color="C9DDF2" w:sz="6" w:space="3"/>
+          <w:left w:val="single" w:color="2F6FB3" w:sz="24" w:space="10"/>
+          <w:bottom w:val="single" w:color="C9DDF2" w:sz="6" w:space="3"/>
+          <w:right w:val="single" w:color="C9DDF2" w:sz="6" w:space="3"/>
+        </w:pBdr>
+        <w:shd w:fill="EAF2FB" w:val="clear"/>
+        <w:spacing w:after="150" w:before="60" w:line="252"/>
+      </w:pPr>
+      <w:r>
+        <w:rPr>
+          <w:rFonts w:ascii="Consolas" w:cs="Consolas" w:eastAsia="Consolas" w:hAnsi="Consolas"/>
+          <w:color w:val="103D63"/>
           <w:sz w:val="18"/>
           <w:szCs w:val="18"/>
         </w:rPr>

</xml_diff>